<commit_message>
feat: replace session 6 journal tables with the stage log
Co-Authored-By: Claude Opus 5 <noreply@anthropic.com>
</commit_message>
<xml_diff>
--- a/site/assets/downloads/applied-ai-mastery-personal-journal-en.docx
+++ b/site/assets/downloads/applied-ai-mastery-personal-journal-en.docx
@@ -20016,7 +20016,7 @@
           <w:color w:val="FFFFFF"/>
           <w:rtl w:val="false"/>
         </w:rPr>
-        <w:t xml:space="preserve">Session 6: Tell a True Visual Story</w:t>
+        <w:t xml:space="preserve">Session 6: From Prompt to Presentation</w:t>
       </w:r>
     </w:p>
     <w:p>
@@ -20031,7 +20031,7 @@
           <w:color w:val="17242D"/>
           <w:rtl w:val="false"/>
         </w:rPr>
-        <w:t xml:space="preserve">Plan a short visual story whose audience can understand what is true, selected, edited, or generated.</w:t>
+        <w:t xml:space="preserve">Generate an image, fix it, animate it, generate a second clip from text alone, narrate it, and assemble a deck two ways — labelling every generated piece as you go.</w:t>
       </w:r>
     </w:p>
     <w:p>
@@ -20067,7 +20067,1373 @@
           <w:color w:val="4E356F"/>
           <w:rtl w:val="false"/>
         </w:rPr>
-        <w:t xml:space="preserve">1. Set the story contract</w:t>
+        <w:t xml:space="preserve">1. The production plan</w:t>
+      </w:r>
+    </w:p>
+    <w:tbl>
+      <w:tblPr>
+        <w:bidiVisual w:val="false"/>
+        <w:tblW w:type="dxa" w:w="9026"/>
+        <w:tblBorders>
+          <w:top w:val="single" w:color="auto" w:sz="4"/>
+          <w:left w:val="single" w:color="auto" w:sz="4"/>
+          <w:bottom w:val="single" w:color="auto" w:sz="4"/>
+          <w:right w:val="single" w:color="auto" w:sz="4"/>
+          <w:insideH w:val="single" w:color="auto" w:sz="4"/>
+          <w:insideV w:val="single" w:color="auto" w:sz="4"/>
+        </w:tblBorders>
+        <w:tblLayout w:type="fixed"/>
+      </w:tblPr>
+      <w:tblGrid>
+        <w:gridCol w:w="2258"/>
+        <w:gridCol w:w="2256"/>
+        <w:gridCol w:w="2256"/>
+        <w:gridCol w:w="2256"/>
+      </w:tblGrid>
+      <w:tr>
+        <w:tc>
+          <w:tcPr>
+            <w:tcW w:type="dxa" w:w="2258"/>
+            <w:shd w:fill="4E356F"/>
+          </w:tcPr>
+          <w:p>
+            <w:pPr>
+              <w:bidi w:val="false"/>
+              <w:jc w:val="left"/>
+            </w:pPr>
+            <w:r>
+              <w:rPr>
+                <w:b/>
+                <w:bCs/>
+                <w:i w:val="false"/>
+                <w:iCs w:val="false"/>
+                <w:color w:val="FFFFFF"/>
+                <w:rtl w:val="false"/>
+              </w:rPr>
+              <w:t xml:space="preserve">Subject</w:t>
+            </w:r>
+          </w:p>
+        </w:tc>
+        <w:tc>
+          <w:tcPr>
+            <w:tcW w:type="dxa" w:w="2256"/>
+            <w:shd w:fill="4E356F"/>
+          </w:tcPr>
+          <w:p>
+            <w:pPr>
+              <w:bidi w:val="false"/>
+              <w:jc w:val="left"/>
+            </w:pPr>
+            <w:r>
+              <w:rPr>
+                <w:b/>
+                <w:bCs/>
+                <w:i w:val="false"/>
+                <w:iCs w:val="false"/>
+                <w:color w:val="FFFFFF"/>
+                <w:rtl w:val="false"/>
+              </w:rPr>
+              <w:t xml:space="preserve">Audience</w:t>
+            </w:r>
+          </w:p>
+        </w:tc>
+        <w:tc>
+          <w:tcPr>
+            <w:tcW w:type="dxa" w:w="2256"/>
+            <w:shd w:fill="4E356F"/>
+          </w:tcPr>
+          <w:p>
+            <w:pPr>
+              <w:bidi w:val="false"/>
+              <w:jc w:val="left"/>
+            </w:pPr>
+            <w:r>
+              <w:rPr>
+                <w:b/>
+                <w:bCs/>
+                <w:i w:val="false"/>
+                <w:iCs w:val="false"/>
+                <w:color w:val="FFFFFF"/>
+                <w:rtl w:val="false"/>
+              </w:rPr>
+              <w:t xml:space="preserve">What the piece must say</w:t>
+            </w:r>
+          </w:p>
+        </w:tc>
+        <w:tc>
+          <w:tcPr>
+            <w:tcW w:type="dxa" w:w="2256"/>
+            <w:shd w:fill="4E356F"/>
+          </w:tcPr>
+          <w:p>
+            <w:pPr>
+              <w:bidi w:val="false"/>
+              <w:jc w:val="left"/>
+            </w:pPr>
+            <w:r>
+              <w:rPr>
+                <w:b/>
+                <w:bCs/>
+                <w:i w:val="false"/>
+                <w:iCs w:val="false"/>
+                <w:color w:val="FFFFFF"/>
+                <w:rtl w:val="false"/>
+              </w:rPr>
+              <w:t xml:space="preserve">Tool per stage</w:t>
+            </w:r>
+          </w:p>
+        </w:tc>
+      </w:tr>
+      <w:tr>
+        <w:trPr>
+          <w:trHeight w:val="454" w:hRule="atLeast"/>
+        </w:trPr>
+        <w:tc>
+          <w:tcPr>
+            <w:tcW w:type="dxa" w:w="2258"/>
+            <w:shd w:fill="F1F3F6"/>
+          </w:tcPr>
+          <w:p>
+            <w:pPr>
+              <w:bidi w:val="false"/>
+              <w:jc w:val="left"/>
+            </w:pPr>
+            <w:r>
+              <w:rPr>
+                <w:b w:val="false"/>
+                <w:bCs w:val="false"/>
+                <w:i/>
+                <w:iCs/>
+                <w:color w:val="55606E"/>
+                <w:rtl w:val="false"/>
+              </w:rPr>
+              <w:t xml:space="preserve">Example: the walk I do every morning</w:t>
+            </w:r>
+          </w:p>
+        </w:tc>
+        <w:tc>
+          <w:tcPr>
+            <w:tcW w:type="dxa" w:w="2256"/>
+            <w:shd w:fill="F1F3F6"/>
+          </w:tcPr>
+          <w:p>
+            <w:pPr>
+              <w:bidi w:val="false"/>
+              <w:jc w:val="left"/>
+            </w:pPr>
+            <w:r>
+              <w:rPr>
+                <w:b w:val="false"/>
+                <w:bCs w:val="false"/>
+                <w:i/>
+                <w:iCs/>
+                <w:color w:val="55606E"/>
+                <w:rtl w:val="false"/>
+              </w:rPr>
+              <w:t xml:space="preserve">My family</w:t>
+            </w:r>
+          </w:p>
+        </w:tc>
+        <w:tc>
+          <w:tcPr>
+            <w:tcW w:type="dxa" w:w="2256"/>
+            <w:shd w:fill="F1F3F6"/>
+          </w:tcPr>
+          <w:p>
+            <w:pPr>
+              <w:bidi w:val="false"/>
+              <w:jc w:val="left"/>
+            </w:pPr>
+            <w:r>
+              <w:rPr>
+                <w:b w:val="false"/>
+                <w:bCs w:val="false"/>
+                <w:i/>
+                <w:iCs/>
+                <w:color w:val="55606E"/>
+                <w:rtl w:val="false"/>
+              </w:rPr>
+              <w:t xml:space="preserve">That the route is worth an early start</w:t>
+            </w:r>
+          </w:p>
+        </w:tc>
+        <w:tc>
+          <w:tcPr>
+            <w:tcW w:type="dxa" w:w="2256"/>
+            <w:shd w:fill="F1F3F6"/>
+          </w:tcPr>
+          <w:p>
+            <w:pPr>
+              <w:bidi w:val="false"/>
+              <w:jc w:val="left"/>
+            </w:pPr>
+            <w:r>
+              <w:rPr>
+                <w:b w:val="false"/>
+                <w:bCs w:val="false"/>
+                <w:i/>
+                <w:iCs/>
+                <w:color w:val="55606E"/>
+                <w:rtl w:val="false"/>
+              </w:rPr>
+              <w:t xml:space="preserve">Gemini throughout; Claude for the deck</w:t>
+            </w:r>
+          </w:p>
+        </w:tc>
+      </w:tr>
+      <w:tr>
+        <w:trPr>
+          <w:trHeight w:val="454" w:hRule="atLeast"/>
+        </w:trPr>
+        <w:tc>
+          <w:tcPr>
+            <w:tcW w:type="dxa" w:w="2258"/>
+            <w:shd w:fill="FFFFFF"/>
+          </w:tcPr>
+          <w:p>
+            <w:pPr>
+              <w:bidi w:val="false"/>
+              <w:jc w:val="left"/>
+            </w:pPr>
+            <w:r>
+              <w:rPr>
+                <w:b w:val="false"/>
+                <w:bCs w:val="false"/>
+                <w:i w:val="false"/>
+                <w:iCs w:val="false"/>
+                <w:color w:val="17242D"/>
+                <w:rtl w:val="false"/>
+              </w:rPr>
+              <w:t xml:space="preserve"/>
+            </w:r>
+          </w:p>
+        </w:tc>
+        <w:tc>
+          <w:tcPr>
+            <w:tcW w:type="dxa" w:w="2256"/>
+            <w:shd w:fill="FFFFFF"/>
+          </w:tcPr>
+          <w:p>
+            <w:pPr>
+              <w:bidi w:val="false"/>
+              <w:jc w:val="left"/>
+            </w:pPr>
+            <w:r>
+              <w:rPr>
+                <w:b w:val="false"/>
+                <w:bCs w:val="false"/>
+                <w:i w:val="false"/>
+                <w:iCs w:val="false"/>
+                <w:color w:val="17242D"/>
+                <w:rtl w:val="false"/>
+              </w:rPr>
+              <w:t xml:space="preserve"/>
+            </w:r>
+          </w:p>
+        </w:tc>
+        <w:tc>
+          <w:tcPr>
+            <w:tcW w:type="dxa" w:w="2256"/>
+            <w:shd w:fill="FFFFFF"/>
+          </w:tcPr>
+          <w:p>
+            <w:pPr>
+              <w:bidi w:val="false"/>
+              <w:jc w:val="left"/>
+            </w:pPr>
+            <w:r>
+              <w:rPr>
+                <w:b w:val="false"/>
+                <w:bCs w:val="false"/>
+                <w:i w:val="false"/>
+                <w:iCs w:val="false"/>
+                <w:color w:val="17242D"/>
+                <w:rtl w:val="false"/>
+              </w:rPr>
+              <w:t xml:space="preserve"/>
+            </w:r>
+          </w:p>
+        </w:tc>
+        <w:tc>
+          <w:tcPr>
+            <w:tcW w:type="dxa" w:w="2256"/>
+            <w:shd w:fill="FFFFFF"/>
+          </w:tcPr>
+          <w:p>
+            <w:pPr>
+              <w:bidi w:val="false"/>
+              <w:jc w:val="left"/>
+            </w:pPr>
+            <w:r>
+              <w:rPr>
+                <w:b w:val="false"/>
+                <w:bCs w:val="false"/>
+                <w:i w:val="false"/>
+                <w:iCs w:val="false"/>
+                <w:color w:val="17242D"/>
+                <w:rtl w:val="false"/>
+              </w:rPr>
+              <w:t xml:space="preserve"/>
+            </w:r>
+          </w:p>
+        </w:tc>
+      </w:tr>
+    </w:tbl>
+    <w:p>
+      <w:pPr>
+        <w:pStyle w:val="Heading1"/>
+        <w:shd w:fill="F0EAFA"/>
+        <w:bidi w:val="false"/>
+        <w:spacing w:after="100" w:before="200"/>
+        <w:jc w:val="left"/>
+      </w:pPr>
+      <w:r>
+        <w:rPr>
+          <w:b/>
+          <w:bCs/>
+          <w:color w:val="4E356F"/>
+          <w:rtl w:val="false"/>
+        </w:rPr>
+        <w:t xml:space="preserve">2. Stage log</w:t>
+      </w:r>
+    </w:p>
+    <w:tbl>
+      <w:tblPr>
+        <w:bidiVisual w:val="false"/>
+        <w:tblW w:type="dxa" w:w="9026"/>
+        <w:tblBorders>
+          <w:top w:val="single" w:color="auto" w:sz="4"/>
+          <w:left w:val="single" w:color="auto" w:sz="4"/>
+          <w:bottom w:val="single" w:color="auto" w:sz="4"/>
+          <w:right w:val="single" w:color="auto" w:sz="4"/>
+          <w:insideH w:val="single" w:color="auto" w:sz="4"/>
+          <w:insideV w:val="single" w:color="auto" w:sz="4"/>
+        </w:tblBorders>
+        <w:tblLayout w:type="fixed"/>
+      </w:tblPr>
+      <w:tblGrid>
+        <w:gridCol w:w="1506"/>
+        <w:gridCol w:w="1504"/>
+        <w:gridCol w:w="1504"/>
+        <w:gridCol w:w="1504"/>
+        <w:gridCol w:w="1504"/>
+        <w:gridCol w:w="1504"/>
+      </w:tblGrid>
+      <w:tr>
+        <w:tc>
+          <w:tcPr>
+            <w:tcW w:type="dxa" w:w="1506"/>
+            <w:shd w:fill="4E356F"/>
+          </w:tcPr>
+          <w:p>
+            <w:pPr>
+              <w:bidi w:val="false"/>
+              <w:jc w:val="left"/>
+            </w:pPr>
+            <w:r>
+              <w:rPr>
+                <w:b/>
+                <w:bCs/>
+                <w:i w:val="false"/>
+                <w:iCs w:val="false"/>
+                <w:color w:val="FFFFFF"/>
+                <w:rtl w:val="false"/>
+              </w:rPr>
+              <w:t xml:space="preserve">Stage</w:t>
+            </w:r>
+          </w:p>
+        </w:tc>
+        <w:tc>
+          <w:tcPr>
+            <w:tcW w:type="dxa" w:w="1504"/>
+            <w:shd w:fill="4E356F"/>
+          </w:tcPr>
+          <w:p>
+            <w:pPr>
+              <w:bidi w:val="false"/>
+              <w:jc w:val="left"/>
+            </w:pPr>
+            <w:r>
+              <w:rPr>
+                <w:b/>
+                <w:bCs/>
+                <w:i w:val="false"/>
+                <w:iCs w:val="false"/>
+                <w:color w:val="FFFFFF"/>
+                <w:rtl w:val="false"/>
+              </w:rPr>
+              <w:t xml:space="preserve">Tool</w:t>
+            </w:r>
+          </w:p>
+        </w:tc>
+        <w:tc>
+          <w:tcPr>
+            <w:tcW w:type="dxa" w:w="1504"/>
+            <w:shd w:fill="4E356F"/>
+          </w:tcPr>
+          <w:p>
+            <w:pPr>
+              <w:bidi w:val="false"/>
+              <w:jc w:val="left"/>
+            </w:pPr>
+            <w:r>
+              <w:rPr>
+                <w:b/>
+                <w:bCs/>
+                <w:i w:val="false"/>
+                <w:iCs w:val="false"/>
+                <w:color w:val="FFFFFF"/>
+                <w:rtl w:val="false"/>
+              </w:rPr>
+              <w:t xml:space="preserve">Prompt or setting</w:t>
+            </w:r>
+          </w:p>
+        </w:tc>
+        <w:tc>
+          <w:tcPr>
+            <w:tcW w:type="dxa" w:w="1504"/>
+            <w:shd w:fill="4E356F"/>
+          </w:tcPr>
+          <w:p>
+            <w:pPr>
+              <w:bidi w:val="false"/>
+              <w:jc w:val="left"/>
+            </w:pPr>
+            <w:r>
+              <w:rPr>
+                <w:b/>
+                <w:bCs/>
+                <w:i w:val="false"/>
+                <w:iCs w:val="false"/>
+                <w:color w:val="FFFFFF"/>
+                <w:rtl w:val="false"/>
+              </w:rPr>
+              <w:t xml:space="preserve">What came back</w:t>
+            </w:r>
+          </w:p>
+        </w:tc>
+        <w:tc>
+          <w:tcPr>
+            <w:tcW w:type="dxa" w:w="1504"/>
+            <w:shd w:fill="4E356F"/>
+          </w:tcPr>
+          <w:p>
+            <w:pPr>
+              <w:bidi w:val="false"/>
+              <w:jc w:val="left"/>
+            </w:pPr>
+            <w:r>
+              <w:rPr>
+                <w:b/>
+                <w:bCs/>
+                <w:i w:val="false"/>
+                <w:iCs w:val="false"/>
+                <w:color w:val="FFFFFF"/>
+                <w:rtl w:val="false"/>
+              </w:rPr>
+              <w:t xml:space="preserve">What I fixed</w:t>
+            </w:r>
+          </w:p>
+        </w:tc>
+        <w:tc>
+          <w:tcPr>
+            <w:tcW w:type="dxa" w:w="1504"/>
+            <w:shd w:fill="4E356F"/>
+          </w:tcPr>
+          <w:p>
+            <w:pPr>
+              <w:bidi w:val="false"/>
+              <w:jc w:val="left"/>
+            </w:pPr>
+            <w:r>
+              <w:rPr>
+                <w:b/>
+                <w:bCs/>
+                <w:i w:val="false"/>
+                <w:iCs w:val="false"/>
+                <w:color w:val="FFFFFF"/>
+                <w:rtl w:val="false"/>
+              </w:rPr>
+              <w:t xml:space="preserve">Labelled?</w:t>
+            </w:r>
+          </w:p>
+        </w:tc>
+      </w:tr>
+      <w:tr>
+        <w:trPr>
+          <w:trHeight w:val="454" w:hRule="atLeast"/>
+        </w:trPr>
+        <w:tc>
+          <w:tcPr>
+            <w:tcW w:type="dxa" w:w="1506"/>
+            <w:shd w:fill="FFFFFF"/>
+          </w:tcPr>
+          <w:p>
+            <w:pPr>
+              <w:bidi w:val="false"/>
+              <w:jc w:val="left"/>
+            </w:pPr>
+            <w:r>
+              <w:rPr>
+                <w:b w:val="false"/>
+                <w:bCs w:val="false"/>
+                <w:i w:val="false"/>
+                <w:iCs w:val="false"/>
+                <w:color w:val="17242D"/>
+                <w:rtl w:val="false"/>
+              </w:rPr>
+              <w:t xml:space="preserve">1 Generate</w:t>
+            </w:r>
+          </w:p>
+        </w:tc>
+        <w:tc>
+          <w:tcPr>
+            <w:tcW w:type="dxa" w:w="1504"/>
+            <w:shd w:fill="FFFFFF"/>
+          </w:tcPr>
+          <w:p>
+            <w:pPr>
+              <w:bidi w:val="false"/>
+              <w:jc w:val="left"/>
+            </w:pPr>
+            <w:r>
+              <w:rPr>
+                <w:b w:val="false"/>
+                <w:bCs w:val="false"/>
+                <w:i w:val="false"/>
+                <w:iCs w:val="false"/>
+                <w:color w:val="17242D"/>
+                <w:rtl w:val="false"/>
+              </w:rPr>
+              <w:t xml:space="preserve"/>
+            </w:r>
+          </w:p>
+        </w:tc>
+        <w:tc>
+          <w:tcPr>
+            <w:tcW w:type="dxa" w:w="1504"/>
+            <w:shd w:fill="FFFFFF"/>
+          </w:tcPr>
+          <w:p>
+            <w:pPr>
+              <w:bidi w:val="false"/>
+              <w:jc w:val="left"/>
+            </w:pPr>
+            <w:r>
+              <w:rPr>
+                <w:b w:val="false"/>
+                <w:bCs w:val="false"/>
+                <w:i w:val="false"/>
+                <w:iCs w:val="false"/>
+                <w:color w:val="17242D"/>
+                <w:rtl w:val="false"/>
+              </w:rPr>
+              <w:t xml:space="preserve"/>
+            </w:r>
+          </w:p>
+        </w:tc>
+        <w:tc>
+          <w:tcPr>
+            <w:tcW w:type="dxa" w:w="1504"/>
+            <w:shd w:fill="FFFFFF"/>
+          </w:tcPr>
+          <w:p>
+            <w:pPr>
+              <w:bidi w:val="false"/>
+              <w:jc w:val="left"/>
+            </w:pPr>
+            <w:r>
+              <w:rPr>
+                <w:b w:val="false"/>
+                <w:bCs w:val="false"/>
+                <w:i w:val="false"/>
+                <w:iCs w:val="false"/>
+                <w:color w:val="17242D"/>
+                <w:rtl w:val="false"/>
+              </w:rPr>
+              <w:t xml:space="preserve"/>
+            </w:r>
+          </w:p>
+        </w:tc>
+        <w:tc>
+          <w:tcPr>
+            <w:tcW w:type="dxa" w:w="1504"/>
+            <w:shd w:fill="FFFFFF"/>
+          </w:tcPr>
+          <w:p>
+            <w:pPr>
+              <w:bidi w:val="false"/>
+              <w:jc w:val="left"/>
+            </w:pPr>
+            <w:r>
+              <w:rPr>
+                <w:b w:val="false"/>
+                <w:bCs w:val="false"/>
+                <w:i w:val="false"/>
+                <w:iCs w:val="false"/>
+                <w:color w:val="17242D"/>
+                <w:rtl w:val="false"/>
+              </w:rPr>
+              <w:t xml:space="preserve"/>
+            </w:r>
+          </w:p>
+        </w:tc>
+        <w:tc>
+          <w:tcPr>
+            <w:tcW w:type="dxa" w:w="1504"/>
+            <w:shd w:fill="FFFFFF"/>
+          </w:tcPr>
+          <w:p>
+            <w:pPr>
+              <w:bidi w:val="false"/>
+              <w:jc w:val="left"/>
+            </w:pPr>
+            <w:r>
+              <w:rPr>
+                <w:b w:val="false"/>
+                <w:bCs w:val="false"/>
+                <w:i w:val="false"/>
+                <w:iCs w:val="false"/>
+                <w:color w:val="17242D"/>
+                <w:rtl w:val="false"/>
+              </w:rPr>
+              <w:t xml:space="preserve"/>
+            </w:r>
+          </w:p>
+        </w:tc>
+      </w:tr>
+      <w:tr>
+        <w:trPr>
+          <w:trHeight w:val="454" w:hRule="atLeast"/>
+        </w:trPr>
+        <w:tc>
+          <w:tcPr>
+            <w:tcW w:type="dxa" w:w="1506"/>
+            <w:shd w:fill="FFFFFF"/>
+          </w:tcPr>
+          <w:p>
+            <w:pPr>
+              <w:bidi w:val="false"/>
+              <w:jc w:val="left"/>
+            </w:pPr>
+            <w:r>
+              <w:rPr>
+                <w:b w:val="false"/>
+                <w:bCs w:val="false"/>
+                <w:i w:val="false"/>
+                <w:iCs w:val="false"/>
+                <w:color w:val="17242D"/>
+                <w:rtl w:val="false"/>
+              </w:rPr>
+              <w:t xml:space="preserve">2 Fix</w:t>
+            </w:r>
+          </w:p>
+        </w:tc>
+        <w:tc>
+          <w:tcPr>
+            <w:tcW w:type="dxa" w:w="1504"/>
+            <w:shd w:fill="FFFFFF"/>
+          </w:tcPr>
+          <w:p>
+            <w:pPr>
+              <w:bidi w:val="false"/>
+              <w:jc w:val="left"/>
+            </w:pPr>
+            <w:r>
+              <w:rPr>
+                <w:b w:val="false"/>
+                <w:bCs w:val="false"/>
+                <w:i w:val="false"/>
+                <w:iCs w:val="false"/>
+                <w:color w:val="17242D"/>
+                <w:rtl w:val="false"/>
+              </w:rPr>
+              <w:t xml:space="preserve"/>
+            </w:r>
+          </w:p>
+        </w:tc>
+        <w:tc>
+          <w:tcPr>
+            <w:tcW w:type="dxa" w:w="1504"/>
+            <w:shd w:fill="FFFFFF"/>
+          </w:tcPr>
+          <w:p>
+            <w:pPr>
+              <w:bidi w:val="false"/>
+              <w:jc w:val="left"/>
+            </w:pPr>
+            <w:r>
+              <w:rPr>
+                <w:b w:val="false"/>
+                <w:bCs w:val="false"/>
+                <w:i w:val="false"/>
+                <w:iCs w:val="false"/>
+                <w:color w:val="17242D"/>
+                <w:rtl w:val="false"/>
+              </w:rPr>
+              <w:t xml:space="preserve"/>
+            </w:r>
+          </w:p>
+        </w:tc>
+        <w:tc>
+          <w:tcPr>
+            <w:tcW w:type="dxa" w:w="1504"/>
+            <w:shd w:fill="FFFFFF"/>
+          </w:tcPr>
+          <w:p>
+            <w:pPr>
+              <w:bidi w:val="false"/>
+              <w:jc w:val="left"/>
+            </w:pPr>
+            <w:r>
+              <w:rPr>
+                <w:b w:val="false"/>
+                <w:bCs w:val="false"/>
+                <w:i w:val="false"/>
+                <w:iCs w:val="false"/>
+                <w:color w:val="17242D"/>
+                <w:rtl w:val="false"/>
+              </w:rPr>
+              <w:t xml:space="preserve"/>
+            </w:r>
+          </w:p>
+        </w:tc>
+        <w:tc>
+          <w:tcPr>
+            <w:tcW w:type="dxa" w:w="1504"/>
+            <w:shd w:fill="FFFFFF"/>
+          </w:tcPr>
+          <w:p>
+            <w:pPr>
+              <w:bidi w:val="false"/>
+              <w:jc w:val="left"/>
+            </w:pPr>
+            <w:r>
+              <w:rPr>
+                <w:b w:val="false"/>
+                <w:bCs w:val="false"/>
+                <w:i w:val="false"/>
+                <w:iCs w:val="false"/>
+                <w:color w:val="17242D"/>
+                <w:rtl w:val="false"/>
+              </w:rPr>
+              <w:t xml:space="preserve"/>
+            </w:r>
+          </w:p>
+        </w:tc>
+        <w:tc>
+          <w:tcPr>
+            <w:tcW w:type="dxa" w:w="1504"/>
+            <w:shd w:fill="FFFFFF"/>
+          </w:tcPr>
+          <w:p>
+            <w:pPr>
+              <w:bidi w:val="false"/>
+              <w:jc w:val="left"/>
+            </w:pPr>
+            <w:r>
+              <w:rPr>
+                <w:b w:val="false"/>
+                <w:bCs w:val="false"/>
+                <w:i w:val="false"/>
+                <w:iCs w:val="false"/>
+                <w:color w:val="17242D"/>
+                <w:rtl w:val="false"/>
+              </w:rPr>
+              <w:t xml:space="preserve"/>
+            </w:r>
+          </w:p>
+        </w:tc>
+      </w:tr>
+      <w:tr>
+        <w:trPr>
+          <w:trHeight w:val="454" w:hRule="atLeast"/>
+        </w:trPr>
+        <w:tc>
+          <w:tcPr>
+            <w:tcW w:type="dxa" w:w="1506"/>
+            <w:shd w:fill="FFFFFF"/>
+          </w:tcPr>
+          <w:p>
+            <w:pPr>
+              <w:bidi w:val="false"/>
+              <w:jc w:val="left"/>
+            </w:pPr>
+            <w:r>
+              <w:rPr>
+                <w:b w:val="false"/>
+                <w:bCs w:val="false"/>
+                <w:i w:val="false"/>
+                <w:iCs w:val="false"/>
+                <w:color w:val="17242D"/>
+                <w:rtl w:val="false"/>
+              </w:rPr>
+              <w:t xml:space="preserve">3 Move</w:t>
+            </w:r>
+          </w:p>
+        </w:tc>
+        <w:tc>
+          <w:tcPr>
+            <w:tcW w:type="dxa" w:w="1504"/>
+            <w:shd w:fill="FFFFFF"/>
+          </w:tcPr>
+          <w:p>
+            <w:pPr>
+              <w:bidi w:val="false"/>
+              <w:jc w:val="left"/>
+            </w:pPr>
+            <w:r>
+              <w:rPr>
+                <w:b w:val="false"/>
+                <w:bCs w:val="false"/>
+                <w:i w:val="false"/>
+                <w:iCs w:val="false"/>
+                <w:color w:val="17242D"/>
+                <w:rtl w:val="false"/>
+              </w:rPr>
+              <w:t xml:space="preserve"/>
+            </w:r>
+          </w:p>
+        </w:tc>
+        <w:tc>
+          <w:tcPr>
+            <w:tcW w:type="dxa" w:w="1504"/>
+            <w:shd w:fill="FFFFFF"/>
+          </w:tcPr>
+          <w:p>
+            <w:pPr>
+              <w:bidi w:val="false"/>
+              <w:jc w:val="left"/>
+            </w:pPr>
+            <w:r>
+              <w:rPr>
+                <w:b w:val="false"/>
+                <w:bCs w:val="false"/>
+                <w:i w:val="false"/>
+                <w:iCs w:val="false"/>
+                <w:color w:val="17242D"/>
+                <w:rtl w:val="false"/>
+              </w:rPr>
+              <w:t xml:space="preserve"/>
+            </w:r>
+          </w:p>
+        </w:tc>
+        <w:tc>
+          <w:tcPr>
+            <w:tcW w:type="dxa" w:w="1504"/>
+            <w:shd w:fill="FFFFFF"/>
+          </w:tcPr>
+          <w:p>
+            <w:pPr>
+              <w:bidi w:val="false"/>
+              <w:jc w:val="left"/>
+            </w:pPr>
+            <w:r>
+              <w:rPr>
+                <w:b w:val="false"/>
+                <w:bCs w:val="false"/>
+                <w:i w:val="false"/>
+                <w:iCs w:val="false"/>
+                <w:color w:val="17242D"/>
+                <w:rtl w:val="false"/>
+              </w:rPr>
+              <w:t xml:space="preserve"/>
+            </w:r>
+          </w:p>
+        </w:tc>
+        <w:tc>
+          <w:tcPr>
+            <w:tcW w:type="dxa" w:w="1504"/>
+            <w:shd w:fill="FFFFFF"/>
+          </w:tcPr>
+          <w:p>
+            <w:pPr>
+              <w:bidi w:val="false"/>
+              <w:jc w:val="left"/>
+            </w:pPr>
+            <w:r>
+              <w:rPr>
+                <w:b w:val="false"/>
+                <w:bCs w:val="false"/>
+                <w:i w:val="false"/>
+                <w:iCs w:val="false"/>
+                <w:color w:val="17242D"/>
+                <w:rtl w:val="false"/>
+              </w:rPr>
+              <w:t xml:space="preserve"/>
+            </w:r>
+          </w:p>
+        </w:tc>
+        <w:tc>
+          <w:tcPr>
+            <w:tcW w:type="dxa" w:w="1504"/>
+            <w:shd w:fill="FFFFFF"/>
+          </w:tcPr>
+          <w:p>
+            <w:pPr>
+              <w:bidi w:val="false"/>
+              <w:jc w:val="left"/>
+            </w:pPr>
+            <w:r>
+              <w:rPr>
+                <w:b w:val="false"/>
+                <w:bCs w:val="false"/>
+                <w:i w:val="false"/>
+                <w:iCs w:val="false"/>
+                <w:color w:val="17242D"/>
+                <w:rtl w:val="false"/>
+              </w:rPr>
+              <w:t xml:space="preserve"/>
+            </w:r>
+          </w:p>
+        </w:tc>
+      </w:tr>
+      <w:tr>
+        <w:trPr>
+          <w:trHeight w:val="454" w:hRule="atLeast"/>
+        </w:trPr>
+        <w:tc>
+          <w:tcPr>
+            <w:tcW w:type="dxa" w:w="1506"/>
+            <w:shd w:fill="FFFFFF"/>
+          </w:tcPr>
+          <w:p>
+            <w:pPr>
+              <w:bidi w:val="false"/>
+              <w:jc w:val="left"/>
+            </w:pPr>
+            <w:r>
+              <w:rPr>
+                <w:b w:val="false"/>
+                <w:bCs w:val="false"/>
+                <w:i w:val="false"/>
+                <w:iCs w:val="false"/>
+                <w:color w:val="17242D"/>
+                <w:rtl w:val="false"/>
+              </w:rPr>
+              <w:t xml:space="preserve">4 Video</w:t>
+            </w:r>
+          </w:p>
+        </w:tc>
+        <w:tc>
+          <w:tcPr>
+            <w:tcW w:type="dxa" w:w="1504"/>
+            <w:shd w:fill="FFFFFF"/>
+          </w:tcPr>
+          <w:p>
+            <w:pPr>
+              <w:bidi w:val="false"/>
+              <w:jc w:val="left"/>
+            </w:pPr>
+            <w:r>
+              <w:rPr>
+                <w:b w:val="false"/>
+                <w:bCs w:val="false"/>
+                <w:i w:val="false"/>
+                <w:iCs w:val="false"/>
+                <w:color w:val="17242D"/>
+                <w:rtl w:val="false"/>
+              </w:rPr>
+              <w:t xml:space="preserve"/>
+            </w:r>
+          </w:p>
+        </w:tc>
+        <w:tc>
+          <w:tcPr>
+            <w:tcW w:type="dxa" w:w="1504"/>
+            <w:shd w:fill="FFFFFF"/>
+          </w:tcPr>
+          <w:p>
+            <w:pPr>
+              <w:bidi w:val="false"/>
+              <w:jc w:val="left"/>
+            </w:pPr>
+            <w:r>
+              <w:rPr>
+                <w:b w:val="false"/>
+                <w:bCs w:val="false"/>
+                <w:i w:val="false"/>
+                <w:iCs w:val="false"/>
+                <w:color w:val="17242D"/>
+                <w:rtl w:val="false"/>
+              </w:rPr>
+              <w:t xml:space="preserve"/>
+            </w:r>
+          </w:p>
+        </w:tc>
+        <w:tc>
+          <w:tcPr>
+            <w:tcW w:type="dxa" w:w="1504"/>
+            <w:shd w:fill="FFFFFF"/>
+          </w:tcPr>
+          <w:p>
+            <w:pPr>
+              <w:bidi w:val="false"/>
+              <w:jc w:val="left"/>
+            </w:pPr>
+            <w:r>
+              <w:rPr>
+                <w:b w:val="false"/>
+                <w:bCs w:val="false"/>
+                <w:i w:val="false"/>
+                <w:iCs w:val="false"/>
+                <w:color w:val="17242D"/>
+                <w:rtl w:val="false"/>
+              </w:rPr>
+              <w:t xml:space="preserve"/>
+            </w:r>
+          </w:p>
+        </w:tc>
+        <w:tc>
+          <w:tcPr>
+            <w:tcW w:type="dxa" w:w="1504"/>
+            <w:shd w:fill="FFFFFF"/>
+          </w:tcPr>
+          <w:p>
+            <w:pPr>
+              <w:bidi w:val="false"/>
+              <w:jc w:val="left"/>
+            </w:pPr>
+            <w:r>
+              <w:rPr>
+                <w:b w:val="false"/>
+                <w:bCs w:val="false"/>
+                <w:i w:val="false"/>
+                <w:iCs w:val="false"/>
+                <w:color w:val="17242D"/>
+                <w:rtl w:val="false"/>
+              </w:rPr>
+              <w:t xml:space="preserve"/>
+            </w:r>
+          </w:p>
+        </w:tc>
+        <w:tc>
+          <w:tcPr>
+            <w:tcW w:type="dxa" w:w="1504"/>
+            <w:shd w:fill="FFFFFF"/>
+          </w:tcPr>
+          <w:p>
+            <w:pPr>
+              <w:bidi w:val="false"/>
+              <w:jc w:val="left"/>
+            </w:pPr>
+            <w:r>
+              <w:rPr>
+                <w:b w:val="false"/>
+                <w:bCs w:val="false"/>
+                <w:i w:val="false"/>
+                <w:iCs w:val="false"/>
+                <w:color w:val="17242D"/>
+                <w:rtl w:val="false"/>
+              </w:rPr>
+              <w:t xml:space="preserve"/>
+            </w:r>
+          </w:p>
+        </w:tc>
+      </w:tr>
+      <w:tr>
+        <w:trPr>
+          <w:trHeight w:val="454" w:hRule="atLeast"/>
+        </w:trPr>
+        <w:tc>
+          <w:tcPr>
+            <w:tcW w:type="dxa" w:w="1506"/>
+            <w:shd w:fill="FFFFFF"/>
+          </w:tcPr>
+          <w:p>
+            <w:pPr>
+              <w:bidi w:val="false"/>
+              <w:jc w:val="left"/>
+            </w:pPr>
+            <w:r>
+              <w:rPr>
+                <w:b w:val="false"/>
+                <w:bCs w:val="false"/>
+                <w:i w:val="false"/>
+                <w:iCs w:val="false"/>
+                <w:color w:val="17242D"/>
+                <w:rtl w:val="false"/>
+              </w:rPr>
+              <w:t xml:space="preserve">5 Narrate</w:t>
+            </w:r>
+          </w:p>
+        </w:tc>
+        <w:tc>
+          <w:tcPr>
+            <w:tcW w:type="dxa" w:w="1504"/>
+            <w:shd w:fill="FFFFFF"/>
+          </w:tcPr>
+          <w:p>
+            <w:pPr>
+              <w:bidi w:val="false"/>
+              <w:jc w:val="left"/>
+            </w:pPr>
+            <w:r>
+              <w:rPr>
+                <w:b w:val="false"/>
+                <w:bCs w:val="false"/>
+                <w:i w:val="false"/>
+                <w:iCs w:val="false"/>
+                <w:color w:val="17242D"/>
+                <w:rtl w:val="false"/>
+              </w:rPr>
+              <w:t xml:space="preserve"/>
+            </w:r>
+          </w:p>
+        </w:tc>
+        <w:tc>
+          <w:tcPr>
+            <w:tcW w:type="dxa" w:w="1504"/>
+            <w:shd w:fill="FFFFFF"/>
+          </w:tcPr>
+          <w:p>
+            <w:pPr>
+              <w:bidi w:val="false"/>
+              <w:jc w:val="left"/>
+            </w:pPr>
+            <w:r>
+              <w:rPr>
+                <w:b w:val="false"/>
+                <w:bCs w:val="false"/>
+                <w:i w:val="false"/>
+                <w:iCs w:val="false"/>
+                <w:color w:val="17242D"/>
+                <w:rtl w:val="false"/>
+              </w:rPr>
+              <w:t xml:space="preserve"/>
+            </w:r>
+          </w:p>
+        </w:tc>
+        <w:tc>
+          <w:tcPr>
+            <w:tcW w:type="dxa" w:w="1504"/>
+            <w:shd w:fill="FFFFFF"/>
+          </w:tcPr>
+          <w:p>
+            <w:pPr>
+              <w:bidi w:val="false"/>
+              <w:jc w:val="left"/>
+            </w:pPr>
+            <w:r>
+              <w:rPr>
+                <w:b w:val="false"/>
+                <w:bCs w:val="false"/>
+                <w:i w:val="false"/>
+                <w:iCs w:val="false"/>
+                <w:color w:val="17242D"/>
+                <w:rtl w:val="false"/>
+              </w:rPr>
+              <w:t xml:space="preserve"/>
+            </w:r>
+          </w:p>
+        </w:tc>
+        <w:tc>
+          <w:tcPr>
+            <w:tcW w:type="dxa" w:w="1504"/>
+            <w:shd w:fill="FFFFFF"/>
+          </w:tcPr>
+          <w:p>
+            <w:pPr>
+              <w:bidi w:val="false"/>
+              <w:jc w:val="left"/>
+            </w:pPr>
+            <w:r>
+              <w:rPr>
+                <w:b w:val="false"/>
+                <w:bCs w:val="false"/>
+                <w:i w:val="false"/>
+                <w:iCs w:val="false"/>
+                <w:color w:val="17242D"/>
+                <w:rtl w:val="false"/>
+              </w:rPr>
+              <w:t xml:space="preserve"/>
+            </w:r>
+          </w:p>
+        </w:tc>
+        <w:tc>
+          <w:tcPr>
+            <w:tcW w:type="dxa" w:w="1504"/>
+            <w:shd w:fill="FFFFFF"/>
+          </w:tcPr>
+          <w:p>
+            <w:pPr>
+              <w:bidi w:val="false"/>
+              <w:jc w:val="left"/>
+            </w:pPr>
+            <w:r>
+              <w:rPr>
+                <w:b w:val="false"/>
+                <w:bCs w:val="false"/>
+                <w:i w:val="false"/>
+                <w:iCs w:val="false"/>
+                <w:color w:val="17242D"/>
+                <w:rtl w:val="false"/>
+              </w:rPr>
+              <w:t xml:space="preserve"/>
+            </w:r>
+          </w:p>
+        </w:tc>
+      </w:tr>
+      <w:tr>
+        <w:trPr>
+          <w:trHeight w:val="454" w:hRule="atLeast"/>
+        </w:trPr>
+        <w:tc>
+          <w:tcPr>
+            <w:tcW w:type="dxa" w:w="1506"/>
+            <w:shd w:fill="FFFFFF"/>
+          </w:tcPr>
+          <w:p>
+            <w:pPr>
+              <w:bidi w:val="false"/>
+              <w:jc w:val="left"/>
+            </w:pPr>
+            <w:r>
+              <w:rPr>
+                <w:b w:val="false"/>
+                <w:bCs w:val="false"/>
+                <w:i w:val="false"/>
+                <w:iCs w:val="false"/>
+                <w:color w:val="17242D"/>
+                <w:rtl w:val="false"/>
+              </w:rPr>
+              <w:t xml:space="preserve">6 Assemble</w:t>
+            </w:r>
+          </w:p>
+        </w:tc>
+        <w:tc>
+          <w:tcPr>
+            <w:tcW w:type="dxa" w:w="1504"/>
+            <w:shd w:fill="FFFFFF"/>
+          </w:tcPr>
+          <w:p>
+            <w:pPr>
+              <w:bidi w:val="false"/>
+              <w:jc w:val="left"/>
+            </w:pPr>
+            <w:r>
+              <w:rPr>
+                <w:b w:val="false"/>
+                <w:bCs w:val="false"/>
+                <w:i w:val="false"/>
+                <w:iCs w:val="false"/>
+                <w:color w:val="17242D"/>
+                <w:rtl w:val="false"/>
+              </w:rPr>
+              <w:t xml:space="preserve"/>
+            </w:r>
+          </w:p>
+        </w:tc>
+        <w:tc>
+          <w:tcPr>
+            <w:tcW w:type="dxa" w:w="1504"/>
+            <w:shd w:fill="FFFFFF"/>
+          </w:tcPr>
+          <w:p>
+            <w:pPr>
+              <w:bidi w:val="false"/>
+              <w:jc w:val="left"/>
+            </w:pPr>
+            <w:r>
+              <w:rPr>
+                <w:b w:val="false"/>
+                <w:bCs w:val="false"/>
+                <w:i w:val="false"/>
+                <w:iCs w:val="false"/>
+                <w:color w:val="17242D"/>
+                <w:rtl w:val="false"/>
+              </w:rPr>
+              <w:t xml:space="preserve"/>
+            </w:r>
+          </w:p>
+        </w:tc>
+        <w:tc>
+          <w:tcPr>
+            <w:tcW w:type="dxa" w:w="1504"/>
+            <w:shd w:fill="FFFFFF"/>
+          </w:tcPr>
+          <w:p>
+            <w:pPr>
+              <w:bidi w:val="false"/>
+              <w:jc w:val="left"/>
+            </w:pPr>
+            <w:r>
+              <w:rPr>
+                <w:b w:val="false"/>
+                <w:bCs w:val="false"/>
+                <w:i w:val="false"/>
+                <w:iCs w:val="false"/>
+                <w:color w:val="17242D"/>
+                <w:rtl w:val="false"/>
+              </w:rPr>
+              <w:t xml:space="preserve"/>
+            </w:r>
+          </w:p>
+        </w:tc>
+        <w:tc>
+          <w:tcPr>
+            <w:tcW w:type="dxa" w:w="1504"/>
+            <w:shd w:fill="FFFFFF"/>
+          </w:tcPr>
+          <w:p>
+            <w:pPr>
+              <w:bidi w:val="false"/>
+              <w:jc w:val="left"/>
+            </w:pPr>
+            <w:r>
+              <w:rPr>
+                <w:b w:val="false"/>
+                <w:bCs w:val="false"/>
+                <w:i w:val="false"/>
+                <w:iCs w:val="false"/>
+                <w:color w:val="17242D"/>
+                <w:rtl w:val="false"/>
+              </w:rPr>
+              <w:t xml:space="preserve"/>
+            </w:r>
+          </w:p>
+        </w:tc>
+        <w:tc>
+          <w:tcPr>
+            <w:tcW w:type="dxa" w:w="1504"/>
+            <w:shd w:fill="FFFFFF"/>
+          </w:tcPr>
+          <w:p>
+            <w:pPr>
+              <w:bidi w:val="false"/>
+              <w:jc w:val="left"/>
+            </w:pPr>
+            <w:r>
+              <w:rPr>
+                <w:b w:val="false"/>
+                <w:bCs w:val="false"/>
+                <w:i w:val="false"/>
+                <w:iCs w:val="false"/>
+                <w:color w:val="17242D"/>
+                <w:rtl w:val="false"/>
+              </w:rPr>
+              <w:t xml:space="preserve"/>
+            </w:r>
+          </w:p>
+        </w:tc>
+      </w:tr>
+    </w:tbl>
+    <w:p>
+      <w:pPr>
+        <w:pStyle w:val="Heading1"/>
+        <w:shd w:fill="F0EAFA"/>
+        <w:bidi w:val="false"/>
+        <w:spacing w:after="100" w:before="200"/>
+        <w:jc w:val="left"/>
+      </w:pPr>
+      <w:r>
+        <w:rPr>
+          <w:b/>
+          <w:bCs/>
+          <w:color w:val="4E356F"/>
+          <w:rtl w:val="false"/>
+        </w:rPr>
+        <w:t xml:space="preserve">3. Tool verdict</w:t>
       </w:r>
     </w:p>
     <w:tbl>
@@ -20111,7 +21477,7 @@
                 <w:color w:val="FFFFFF"/>
                 <w:rtl w:val="false"/>
               </w:rPr>
-              <w:t xml:space="preserve">Purpose and audience</w:t>
+              <w:t xml:space="preserve">Tool</w:t>
             </w:r>
           </w:p>
         </w:tc>
@@ -20134,7 +21500,7 @@
                 <w:color w:val="FFFFFF"/>
                 <w:rtl w:val="false"/>
               </w:rPr>
-              <w:t xml:space="preserve">Main message</w:t>
+              <w:t xml:space="preserve">Did I hit a free limit?</w:t>
             </w:r>
           </w:p>
         </w:tc>
@@ -20157,7 +21523,7 @@
                 <w:color w:val="FFFFFF"/>
                 <w:rtl w:val="false"/>
               </w:rPr>
-              <w:t xml:space="preserve">Format</w:t>
+              <w:t xml:space="preserve">What it did well</w:t>
             </w:r>
           </w:p>
         </w:tc>
@@ -20180,7 +21546,7 @@
                 <w:color w:val="FFFFFF"/>
                 <w:rtl w:val="false"/>
               </w:rPr>
-              <w:t xml:space="preserve">Source assets</w:t>
+              <w:t xml:space="preserve">What it did badly</w:t>
             </w:r>
           </w:p>
         </w:tc>
@@ -20203,7 +21569,7 @@
                 <w:color w:val="FFFFFF"/>
                 <w:rtl w:val="false"/>
               </w:rPr>
-              <w:t xml:space="preserve">Consent / permission</w:t>
+              <w:t xml:space="preserve">Use again?</w:t>
             </w:r>
           </w:p>
         </w:tc>
@@ -20215,1871 +21581,98 @@
         <w:tc>
           <w:tcPr>
             <w:tcW w:type="dxa" w:w="1806"/>
-            <w:shd w:fill="F1F3F6"/>
-          </w:tcPr>
-          <w:p>
-            <w:pPr>
-              <w:bidi w:val="false"/>
-              <w:jc w:val="left"/>
-            </w:pPr>
-            <w:r>
-              <w:rPr>
-                <w:b w:val="false"/>
-                <w:bCs w:val="false"/>
-                <w:i/>
-                <w:iCs/>
-                <w:color w:val="55606E"/>
-                <w:rtl w:val="false"/>
-              </w:rPr>
-              <w:t xml:space="preserve">Example: Show my running group why the new route is safer</w:t>
+            <w:shd w:fill="FFFFFF"/>
+          </w:tcPr>
+          <w:p>
+            <w:pPr>
+              <w:bidi w:val="false"/>
+              <w:jc w:val="left"/>
+            </w:pPr>
+            <w:r>
+              <w:rPr>
+                <w:b w:val="false"/>
+                <w:bCs w:val="false"/>
+                <w:i w:val="false"/>
+                <w:iCs w:val="false"/>
+                <w:color w:val="17242D"/>
+                <w:rtl w:val="false"/>
+              </w:rPr>
+              <w:t xml:space="preserve"/>
             </w:r>
           </w:p>
         </w:tc>
         <w:tc>
           <w:tcPr>
             <w:tcW w:type="dxa" w:w="1805"/>
-            <w:shd w:fill="F1F3F6"/>
-          </w:tcPr>
-          <w:p>
-            <w:pPr>
-              <w:bidi w:val="false"/>
-              <w:jc w:val="left"/>
-            </w:pPr>
-            <w:r>
-              <w:rPr>
-                <w:b w:val="false"/>
-                <w:bCs w:val="false"/>
-                <w:i/>
-                <w:iCs/>
-                <w:color w:val="55606E"/>
-                <w:rtl w:val="false"/>
-              </w:rPr>
-              <w:t xml:space="preserve">The new route has wider, better-lit pavements</w:t>
+            <w:shd w:fill="FFFFFF"/>
+          </w:tcPr>
+          <w:p>
+            <w:pPr>
+              <w:bidi w:val="false"/>
+              <w:jc w:val="left"/>
+            </w:pPr>
+            <w:r>
+              <w:rPr>
+                <w:b w:val="false"/>
+                <w:bCs w:val="false"/>
+                <w:i w:val="false"/>
+                <w:iCs w:val="false"/>
+                <w:color w:val="17242D"/>
+                <w:rtl w:val="false"/>
+              </w:rPr>
+              <w:t xml:space="preserve"/>
             </w:r>
           </w:p>
         </w:tc>
         <w:tc>
           <w:tcPr>
             <w:tcW w:type="dxa" w:w="1805"/>
-            <w:shd w:fill="F1F3F6"/>
-          </w:tcPr>
-          <w:p>
-            <w:pPr>
-              <w:bidi w:val="false"/>
-              <w:jc w:val="left"/>
-            </w:pPr>
-            <w:r>
-              <w:rPr>
-                <w:b w:val="false"/>
-                <w:bCs w:val="false"/>
-                <w:i/>
-                <w:iCs/>
-                <w:color w:val="55606E"/>
-                <w:rtl w:val="false"/>
-              </w:rPr>
-              <w:t xml:space="preserve">60-second vertical video</w:t>
+            <w:shd w:fill="FFFFFF"/>
+          </w:tcPr>
+          <w:p>
+            <w:pPr>
+              <w:bidi w:val="false"/>
+              <w:jc w:val="left"/>
+            </w:pPr>
+            <w:r>
+              <w:rPr>
+                <w:b w:val="false"/>
+                <w:bCs w:val="false"/>
+                <w:i w:val="false"/>
+                <w:iCs w:val="false"/>
+                <w:color w:val="17242D"/>
+                <w:rtl w:val="false"/>
+              </w:rPr>
+              <w:t xml:space="preserve"/>
             </w:r>
           </w:p>
         </w:tc>
         <w:tc>
           <w:tcPr>
             <w:tcW w:type="dxa" w:w="1805"/>
-            <w:shd w:fill="F1F3F6"/>
-          </w:tcPr>
-          <w:p>
-            <w:pPr>
-              <w:bidi w:val="false"/>
-              <w:jc w:val="left"/>
-            </w:pPr>
-            <w:r>
-              <w:rPr>
-                <w:b w:val="false"/>
-                <w:bCs w:val="false"/>
-                <w:i/>
-                <w:iCs/>
-                <w:color w:val="55606E"/>
-                <w:rtl w:val="false"/>
-              </w:rPr>
-              <w:t xml:space="preserve">Eight of my own photos and one AI-generated map illustration</w:t>
+            <w:shd w:fill="FFFFFF"/>
+          </w:tcPr>
+          <w:p>
+            <w:pPr>
+              <w:bidi w:val="false"/>
+              <w:jc w:val="left"/>
+            </w:pPr>
+            <w:r>
+              <w:rPr>
+                <w:b w:val="false"/>
+                <w:bCs w:val="false"/>
+                <w:i w:val="false"/>
+                <w:iCs w:val="false"/>
+                <w:color w:val="17242D"/>
+                <w:rtl w:val="false"/>
+              </w:rPr>
+              <w:t xml:space="preserve"/>
             </w:r>
           </w:p>
         </w:tc>
         <w:tc>
           <w:tcPr>
             <w:tcW w:type="dxa" w:w="1805"/>
-            <w:shd w:fill="F1F3F6"/>
-          </w:tcPr>
-          <w:p>
-            <w:pPr>
-              <w:bidi w:val="false"/>
-              <w:jc w:val="left"/>
-            </w:pPr>
-            <w:r>
-              <w:rPr>
-                <w:b w:val="false"/>
-                <w:bCs w:val="false"/>
-                <w:i/>
-                <w:iCs/>
-                <w:color w:val="55606E"/>
-                <w:rtl w:val="false"/>
-              </w:rPr>
-              <w:t xml:space="preserve">Two runners appear and both agreed in writing</w:t>
-            </w:r>
-          </w:p>
-        </w:tc>
-      </w:tr>
-      <w:tr>
-        <w:trPr>
-          <w:trHeight w:val="454" w:hRule="atLeast"/>
-        </w:trPr>
-        <w:tc>
-          <w:tcPr>
-            <w:tcW w:type="dxa" w:w="1806"/>
-            <w:shd w:fill="FFFFFF"/>
-          </w:tcPr>
-          <w:p>
-            <w:pPr>
-              <w:bidi w:val="false"/>
-              <w:jc w:val="left"/>
-            </w:pPr>
-            <w:r>
-              <w:rPr>
-                <w:b w:val="false"/>
-                <w:bCs w:val="false"/>
-                <w:i w:val="false"/>
-                <w:iCs w:val="false"/>
-                <w:color w:val="17242D"/>
-                <w:rtl w:val="false"/>
-              </w:rPr>
-              <w:t xml:space="preserve"/>
-            </w:r>
-          </w:p>
-        </w:tc>
-        <w:tc>
-          <w:tcPr>
-            <w:tcW w:type="dxa" w:w="1805"/>
-            <w:shd w:fill="FFFFFF"/>
-          </w:tcPr>
-          <w:p>
-            <w:pPr>
-              <w:bidi w:val="false"/>
-              <w:jc w:val="left"/>
-            </w:pPr>
-            <w:r>
-              <w:rPr>
-                <w:b w:val="false"/>
-                <w:bCs w:val="false"/>
-                <w:i w:val="false"/>
-                <w:iCs w:val="false"/>
-                <w:color w:val="17242D"/>
-                <w:rtl w:val="false"/>
-              </w:rPr>
-              <w:t xml:space="preserve"/>
-            </w:r>
-          </w:p>
-        </w:tc>
-        <w:tc>
-          <w:tcPr>
-            <w:tcW w:type="dxa" w:w="1805"/>
-            <w:shd w:fill="FFFFFF"/>
-          </w:tcPr>
-          <w:p>
-            <w:pPr>
-              <w:bidi w:val="false"/>
-              <w:jc w:val="left"/>
-            </w:pPr>
-            <w:r>
-              <w:rPr>
-                <w:b w:val="false"/>
-                <w:bCs w:val="false"/>
-                <w:i w:val="false"/>
-                <w:iCs w:val="false"/>
-                <w:color w:val="17242D"/>
-                <w:rtl w:val="false"/>
-              </w:rPr>
-              <w:t xml:space="preserve"/>
-            </w:r>
-          </w:p>
-        </w:tc>
-        <w:tc>
-          <w:tcPr>
-            <w:tcW w:type="dxa" w:w="1805"/>
-            <w:shd w:fill="FFFFFF"/>
-          </w:tcPr>
-          <w:p>
-            <w:pPr>
-              <w:bidi w:val="false"/>
-              <w:jc w:val="left"/>
-            </w:pPr>
-            <w:r>
-              <w:rPr>
-                <w:b w:val="false"/>
-                <w:bCs w:val="false"/>
-                <w:i w:val="false"/>
-                <w:iCs w:val="false"/>
-                <w:color w:val="17242D"/>
-                <w:rtl w:val="false"/>
-              </w:rPr>
-              <w:t xml:space="preserve"/>
-            </w:r>
-          </w:p>
-        </w:tc>
-        <w:tc>
-          <w:tcPr>
-            <w:tcW w:type="dxa" w:w="1805"/>
-            <w:shd w:fill="FFFFFF"/>
-          </w:tcPr>
-          <w:p>
-            <w:pPr>
-              <w:bidi w:val="false"/>
-              <w:jc w:val="left"/>
-            </w:pPr>
-            <w:r>
-              <w:rPr>
-                <w:b w:val="false"/>
-                <w:bCs w:val="false"/>
-                <w:i w:val="false"/>
-                <w:iCs w:val="false"/>
-                <w:color w:val="17242D"/>
-                <w:rtl w:val="false"/>
-              </w:rPr>
-              <w:t xml:space="preserve"/>
-            </w:r>
-          </w:p>
-        </w:tc>
-      </w:tr>
-      <w:tr>
-        <w:trPr>
-          <w:trHeight w:val="454" w:hRule="atLeast"/>
-        </w:trPr>
-        <w:tc>
-          <w:tcPr>
-            <w:tcW w:type="dxa" w:w="1806"/>
-            <w:shd w:fill="FFFFFF"/>
-          </w:tcPr>
-          <w:p>
-            <w:pPr>
-              <w:bidi w:val="false"/>
-              <w:jc w:val="left"/>
-            </w:pPr>
-            <w:r>
-              <w:rPr>
-                <w:b w:val="false"/>
-                <w:bCs w:val="false"/>
-                <w:i w:val="false"/>
-                <w:iCs w:val="false"/>
-                <w:color w:val="17242D"/>
-                <w:rtl w:val="false"/>
-              </w:rPr>
-              <w:t xml:space="preserve"/>
-            </w:r>
-          </w:p>
-        </w:tc>
-        <w:tc>
-          <w:tcPr>
-            <w:tcW w:type="dxa" w:w="1805"/>
-            <w:shd w:fill="FFFFFF"/>
-          </w:tcPr>
-          <w:p>
-            <w:pPr>
-              <w:bidi w:val="false"/>
-              <w:jc w:val="left"/>
-            </w:pPr>
-            <w:r>
-              <w:rPr>
-                <w:b w:val="false"/>
-                <w:bCs w:val="false"/>
-                <w:i w:val="false"/>
-                <w:iCs w:val="false"/>
-                <w:color w:val="17242D"/>
-                <w:rtl w:val="false"/>
-              </w:rPr>
-              <w:t xml:space="preserve"/>
-            </w:r>
-          </w:p>
-        </w:tc>
-        <w:tc>
-          <w:tcPr>
-            <w:tcW w:type="dxa" w:w="1805"/>
-            <w:shd w:fill="FFFFFF"/>
-          </w:tcPr>
-          <w:p>
-            <w:pPr>
-              <w:bidi w:val="false"/>
-              <w:jc w:val="left"/>
-            </w:pPr>
-            <w:r>
-              <w:rPr>
-                <w:b w:val="false"/>
-                <w:bCs w:val="false"/>
-                <w:i w:val="false"/>
-                <w:iCs w:val="false"/>
-                <w:color w:val="17242D"/>
-                <w:rtl w:val="false"/>
-              </w:rPr>
-              <w:t xml:space="preserve"/>
-            </w:r>
-          </w:p>
-        </w:tc>
-        <w:tc>
-          <w:tcPr>
-            <w:tcW w:type="dxa" w:w="1805"/>
-            <w:shd w:fill="FFFFFF"/>
-          </w:tcPr>
-          <w:p>
-            <w:pPr>
-              <w:bidi w:val="false"/>
-              <w:jc w:val="left"/>
-            </w:pPr>
-            <w:r>
-              <w:rPr>
-                <w:b w:val="false"/>
-                <w:bCs w:val="false"/>
-                <w:i w:val="false"/>
-                <w:iCs w:val="false"/>
-                <w:color w:val="17242D"/>
-                <w:rtl w:val="false"/>
-              </w:rPr>
-              <w:t xml:space="preserve"/>
-            </w:r>
-          </w:p>
-        </w:tc>
-        <w:tc>
-          <w:tcPr>
-            <w:tcW w:type="dxa" w:w="1805"/>
-            <w:shd w:fill="FFFFFF"/>
-          </w:tcPr>
-          <w:p>
-            <w:pPr>
-              <w:bidi w:val="false"/>
-              <w:jc w:val="left"/>
-            </w:pPr>
-            <w:r>
-              <w:rPr>
-                <w:b w:val="false"/>
-                <w:bCs w:val="false"/>
-                <w:i w:val="false"/>
-                <w:iCs w:val="false"/>
-                <w:color w:val="17242D"/>
-                <w:rtl w:val="false"/>
-              </w:rPr>
-              <w:t xml:space="preserve"/>
-            </w:r>
-          </w:p>
-        </w:tc>
-      </w:tr>
-    </w:tbl>
-    <w:p>
-      <w:pPr>
-        <w:pStyle w:val="Heading1"/>
-        <w:shd w:fill="F0EAFA"/>
-        <w:bidi w:val="false"/>
-        <w:spacing w:after="100" w:before="200"/>
-        <w:jc w:val="left"/>
-      </w:pPr>
-      <w:r>
-        <w:rPr>
-          <w:b/>
-          <w:bCs/>
-          <w:color w:val="4E356F"/>
-          <w:rtl w:val="false"/>
-        </w:rPr>
-        <w:t xml:space="preserve">2. Storyboard the sequence</w:t>
-      </w:r>
-    </w:p>
-    <w:tbl>
-      <w:tblPr>
-        <w:bidiVisual w:val="false"/>
-        <w:tblW w:type="dxa" w:w="9026"/>
-        <w:tblBorders>
-          <w:top w:val="single" w:color="auto" w:sz="4"/>
-          <w:left w:val="single" w:color="auto" w:sz="4"/>
-          <w:bottom w:val="single" w:color="auto" w:sz="4"/>
-          <w:right w:val="single" w:color="auto" w:sz="4"/>
-          <w:insideH w:val="single" w:color="auto" w:sz="4"/>
-          <w:insideV w:val="single" w:color="auto" w:sz="4"/>
-        </w:tblBorders>
-        <w:tblLayout w:type="fixed"/>
-      </w:tblPr>
-      <w:tblGrid>
-        <w:gridCol w:w="1806"/>
-        <w:gridCol w:w="1805"/>
-        <w:gridCol w:w="1805"/>
-        <w:gridCol w:w="1805"/>
-        <w:gridCol w:w="1805"/>
-      </w:tblGrid>
-      <w:tr>
-        <w:tc>
-          <w:tcPr>
-            <w:tcW w:type="dxa" w:w="1806"/>
-            <w:shd w:fill="4E356F"/>
-          </w:tcPr>
-          <w:p>
-            <w:pPr>
-              <w:bidi w:val="false"/>
-              <w:jc w:val="left"/>
-            </w:pPr>
-            <w:r>
-              <w:rPr>
-                <w:b/>
-                <w:bCs/>
-                <w:i w:val="false"/>
-                <w:iCs w:val="false"/>
-                <w:color w:val="FFFFFF"/>
-                <w:rtl w:val="false"/>
-              </w:rPr>
-              <w:t xml:space="preserve">Frame</w:t>
-            </w:r>
-          </w:p>
-        </w:tc>
-        <w:tc>
-          <w:tcPr>
-            <w:tcW w:type="dxa" w:w="1805"/>
-            <w:shd w:fill="4E356F"/>
-          </w:tcPr>
-          <w:p>
-            <w:pPr>
-              <w:bidi w:val="false"/>
-              <w:jc w:val="left"/>
-            </w:pPr>
-            <w:r>
-              <w:rPr>
-                <w:b/>
-                <w:bCs/>
-                <w:i w:val="false"/>
-                <w:iCs w:val="false"/>
-                <w:color w:val="FFFFFF"/>
-                <w:rtl w:val="false"/>
-              </w:rPr>
-              <w:t xml:space="preserve">What the audience sees</w:t>
-            </w:r>
-          </w:p>
-        </w:tc>
-        <w:tc>
-          <w:tcPr>
-            <w:tcW w:type="dxa" w:w="1805"/>
-            <w:shd w:fill="4E356F"/>
-          </w:tcPr>
-          <w:p>
-            <w:pPr>
-              <w:bidi w:val="false"/>
-              <w:jc w:val="left"/>
-            </w:pPr>
-            <w:r>
-              <w:rPr>
-                <w:b/>
-                <w:bCs/>
-                <w:i w:val="false"/>
-                <w:iCs w:val="false"/>
-                <w:color w:val="FFFFFF"/>
-                <w:rtl w:val="false"/>
-              </w:rPr>
-              <w:t xml:space="preserve">Caption / voice</w:t>
-            </w:r>
-          </w:p>
-        </w:tc>
-        <w:tc>
-          <w:tcPr>
-            <w:tcW w:type="dxa" w:w="1805"/>
-            <w:shd w:fill="4E356F"/>
-          </w:tcPr>
-          <w:p>
-            <w:pPr>
-              <w:bidi w:val="false"/>
-              <w:jc w:val="left"/>
-            </w:pPr>
-            <w:r>
-              <w:rPr>
-                <w:b/>
-                <w:bCs/>
-                <w:i w:val="false"/>
-                <w:iCs w:val="false"/>
-                <w:color w:val="FFFFFF"/>
-                <w:rtl w:val="false"/>
-              </w:rPr>
-              <w:t xml:space="preserve">Accessibility note</w:t>
-            </w:r>
-          </w:p>
-        </w:tc>
-        <w:tc>
-          <w:tcPr>
-            <w:tcW w:type="dxa" w:w="1805"/>
-            <w:shd w:fill="4E356F"/>
-          </w:tcPr>
-          <w:p>
-            <w:pPr>
-              <w:bidi w:val="false"/>
-              <w:jc w:val="left"/>
-            </w:pPr>
-            <w:r>
-              <w:rPr>
-                <w:b/>
-                <w:bCs/>
-                <w:i w:val="false"/>
-                <w:iCs w:val="false"/>
-                <w:color w:val="FFFFFF"/>
-                <w:rtl w:val="false"/>
-              </w:rPr>
-              <w:t xml:space="preserve">Label needed?</w:t>
-            </w:r>
-          </w:p>
-        </w:tc>
-      </w:tr>
-      <w:tr>
-        <w:trPr>
-          <w:trHeight w:val="454" w:hRule="atLeast"/>
-        </w:trPr>
-        <w:tc>
-          <w:tcPr>
-            <w:tcW w:type="dxa" w:w="1806"/>
-            <w:shd w:fill="F1F3F6"/>
-          </w:tcPr>
-          <w:p>
-            <w:pPr>
-              <w:bidi w:val="false"/>
-              <w:jc w:val="left"/>
-            </w:pPr>
-            <w:r>
-              <w:rPr>
-                <w:b w:val="false"/>
-                <w:bCs w:val="false"/>
-                <w:i/>
-                <w:iCs/>
-                <w:color w:val="55606E"/>
-                <w:rtl w:val="false"/>
-              </w:rPr>
-              <w:t xml:space="preserve">Example</w:t>
-            </w:r>
-          </w:p>
-        </w:tc>
-        <w:tc>
-          <w:tcPr>
-            <w:tcW w:type="dxa" w:w="1805"/>
-            <w:shd w:fill="F1F3F6"/>
-          </w:tcPr>
-          <w:p>
-            <w:pPr>
-              <w:bidi w:val="false"/>
-              <w:jc w:val="left"/>
-            </w:pPr>
-            <w:r>
-              <w:rPr>
-                <w:b w:val="false"/>
-                <w:bCs w:val="false"/>
-                <w:i/>
-                <w:iCs/>
-                <w:color w:val="55606E"/>
-                <w:rtl w:val="false"/>
-              </w:rPr>
-              <w:t xml:space="preserve">Wide shot of the old junction at dusk</w:t>
-            </w:r>
-          </w:p>
-        </w:tc>
-        <w:tc>
-          <w:tcPr>
-            <w:tcW w:type="dxa" w:w="1805"/>
-            <w:shd w:fill="F1F3F6"/>
-          </w:tcPr>
-          <w:p>
-            <w:pPr>
-              <w:bidi w:val="false"/>
-              <w:jc w:val="left"/>
-            </w:pPr>
-            <w:r>
-              <w:rPr>
-                <w:b w:val="false"/>
-                <w:bCs w:val="false"/>
-                <w:i/>
-                <w:iCs/>
-                <w:color w:val="55606E"/>
-                <w:rtl w:val="false"/>
-              </w:rPr>
-              <w:t xml:space="preserve">"This is where we used to cross."</w:t>
-            </w:r>
-          </w:p>
-        </w:tc>
-        <w:tc>
-          <w:tcPr>
-            <w:tcW w:type="dxa" w:w="1805"/>
-            <w:shd w:fill="F1F3F6"/>
-          </w:tcPr>
-          <w:p>
-            <w:pPr>
-              <w:bidi w:val="false"/>
-              <w:jc w:val="left"/>
-            </w:pPr>
-            <w:r>
-              <w:rPr>
-                <w:b w:val="false"/>
-                <w:bCs w:val="false"/>
-                <w:i/>
-                <w:iCs/>
-                <w:color w:val="55606E"/>
-                <w:rtl w:val="false"/>
-              </w:rPr>
-              <w:t xml:space="preserve">Describe the junction aloud; captions burned into the video</w:t>
-            </w:r>
-          </w:p>
-        </w:tc>
-        <w:tc>
-          <w:tcPr>
-            <w:tcW w:type="dxa" w:w="1805"/>
-            <w:shd w:fill="F1F3F6"/>
-          </w:tcPr>
-          <w:p>
-            <w:pPr>
-              <w:bidi w:val="false"/>
-              <w:jc w:val="left"/>
-            </w:pPr>
-            <w:r>
-              <w:rPr>
-                <w:b w:val="false"/>
-                <w:bCs w:val="false"/>
-                <w:i/>
-                <w:iCs/>
-                <w:color w:val="55606E"/>
-                <w:rtl w:val="false"/>
-              </w:rPr>
-              <w:t xml:space="preserve">No, it is an unedited photo</w:t>
-            </w:r>
-          </w:p>
-        </w:tc>
-      </w:tr>
-      <w:tr>
-        <w:trPr>
-          <w:trHeight w:val="454" w:hRule="atLeast"/>
-        </w:trPr>
-        <w:tc>
-          <w:tcPr>
-            <w:tcW w:type="dxa" w:w="1806"/>
-            <w:shd w:fill="FFFFFF"/>
-          </w:tcPr>
-          <w:p>
-            <w:pPr>
-              <w:bidi w:val="false"/>
-              <w:jc w:val="left"/>
-            </w:pPr>
-            <w:r>
-              <w:rPr>
-                <w:b w:val="false"/>
-                <w:bCs w:val="false"/>
-                <w:i w:val="false"/>
-                <w:iCs w:val="false"/>
-                <w:color w:val="17242D"/>
-                <w:rtl w:val="false"/>
-              </w:rPr>
-              <w:t xml:space="preserve">1</w:t>
-            </w:r>
-          </w:p>
-        </w:tc>
-        <w:tc>
-          <w:tcPr>
-            <w:tcW w:type="dxa" w:w="1805"/>
-            <w:shd w:fill="FFFFFF"/>
-          </w:tcPr>
-          <w:p>
-            <w:pPr>
-              <w:bidi w:val="false"/>
-              <w:jc w:val="left"/>
-            </w:pPr>
-            <w:r>
-              <w:rPr>
-                <w:b w:val="false"/>
-                <w:bCs w:val="false"/>
-                <w:i w:val="false"/>
-                <w:iCs w:val="false"/>
-                <w:color w:val="17242D"/>
-                <w:rtl w:val="false"/>
-              </w:rPr>
-              <w:t xml:space="preserve"/>
-            </w:r>
-          </w:p>
-        </w:tc>
-        <w:tc>
-          <w:tcPr>
-            <w:tcW w:type="dxa" w:w="1805"/>
-            <w:shd w:fill="FFFFFF"/>
-          </w:tcPr>
-          <w:p>
-            <w:pPr>
-              <w:bidi w:val="false"/>
-              <w:jc w:val="left"/>
-            </w:pPr>
-            <w:r>
-              <w:rPr>
-                <w:b w:val="false"/>
-                <w:bCs w:val="false"/>
-                <w:i w:val="false"/>
-                <w:iCs w:val="false"/>
-                <w:color w:val="17242D"/>
-                <w:rtl w:val="false"/>
-              </w:rPr>
-              <w:t xml:space="preserve"/>
-            </w:r>
-          </w:p>
-        </w:tc>
-        <w:tc>
-          <w:tcPr>
-            <w:tcW w:type="dxa" w:w="1805"/>
-            <w:shd w:fill="FFFFFF"/>
-          </w:tcPr>
-          <w:p>
-            <w:pPr>
-              <w:bidi w:val="false"/>
-              <w:jc w:val="left"/>
-            </w:pPr>
-            <w:r>
-              <w:rPr>
-                <w:b w:val="false"/>
-                <w:bCs w:val="false"/>
-                <w:i w:val="false"/>
-                <w:iCs w:val="false"/>
-                <w:color w:val="17242D"/>
-                <w:rtl w:val="false"/>
-              </w:rPr>
-              <w:t xml:space="preserve"/>
-            </w:r>
-          </w:p>
-        </w:tc>
-        <w:tc>
-          <w:tcPr>
-            <w:tcW w:type="dxa" w:w="1805"/>
-            <w:shd w:fill="FFFFFF"/>
-          </w:tcPr>
-          <w:p>
-            <w:pPr>
-              <w:bidi w:val="false"/>
-              <w:jc w:val="left"/>
-            </w:pPr>
-            <w:r>
-              <w:rPr>
-                <w:b w:val="false"/>
-                <w:bCs w:val="false"/>
-                <w:i w:val="false"/>
-                <w:iCs w:val="false"/>
-                <w:color w:val="17242D"/>
-                <w:rtl w:val="false"/>
-              </w:rPr>
-              <w:t xml:space="preserve"/>
-            </w:r>
-          </w:p>
-        </w:tc>
-      </w:tr>
-      <w:tr>
-        <w:trPr>
-          <w:trHeight w:val="454" w:hRule="atLeast"/>
-        </w:trPr>
-        <w:tc>
-          <w:tcPr>
-            <w:tcW w:type="dxa" w:w="1806"/>
-            <w:shd w:fill="FFFFFF"/>
-          </w:tcPr>
-          <w:p>
-            <w:pPr>
-              <w:bidi w:val="false"/>
-              <w:jc w:val="left"/>
-            </w:pPr>
-            <w:r>
-              <w:rPr>
-                <w:b w:val="false"/>
-                <w:bCs w:val="false"/>
-                <w:i w:val="false"/>
-                <w:iCs w:val="false"/>
-                <w:color w:val="17242D"/>
-                <w:rtl w:val="false"/>
-              </w:rPr>
-              <w:t xml:space="preserve">2</w:t>
-            </w:r>
-          </w:p>
-        </w:tc>
-        <w:tc>
-          <w:tcPr>
-            <w:tcW w:type="dxa" w:w="1805"/>
-            <w:shd w:fill="FFFFFF"/>
-          </w:tcPr>
-          <w:p>
-            <w:pPr>
-              <w:bidi w:val="false"/>
-              <w:jc w:val="left"/>
-            </w:pPr>
-            <w:r>
-              <w:rPr>
-                <w:b w:val="false"/>
-                <w:bCs w:val="false"/>
-                <w:i w:val="false"/>
-                <w:iCs w:val="false"/>
-                <w:color w:val="17242D"/>
-                <w:rtl w:val="false"/>
-              </w:rPr>
-              <w:t xml:space="preserve"/>
-            </w:r>
-          </w:p>
-        </w:tc>
-        <w:tc>
-          <w:tcPr>
-            <w:tcW w:type="dxa" w:w="1805"/>
-            <w:shd w:fill="FFFFFF"/>
-          </w:tcPr>
-          <w:p>
-            <w:pPr>
-              <w:bidi w:val="false"/>
-              <w:jc w:val="left"/>
-            </w:pPr>
-            <w:r>
-              <w:rPr>
-                <w:b w:val="false"/>
-                <w:bCs w:val="false"/>
-                <w:i w:val="false"/>
-                <w:iCs w:val="false"/>
-                <w:color w:val="17242D"/>
-                <w:rtl w:val="false"/>
-              </w:rPr>
-              <w:t xml:space="preserve"/>
-            </w:r>
-          </w:p>
-        </w:tc>
-        <w:tc>
-          <w:tcPr>
-            <w:tcW w:type="dxa" w:w="1805"/>
-            <w:shd w:fill="FFFFFF"/>
-          </w:tcPr>
-          <w:p>
-            <w:pPr>
-              <w:bidi w:val="false"/>
-              <w:jc w:val="left"/>
-            </w:pPr>
-            <w:r>
-              <w:rPr>
-                <w:b w:val="false"/>
-                <w:bCs w:val="false"/>
-                <w:i w:val="false"/>
-                <w:iCs w:val="false"/>
-                <w:color w:val="17242D"/>
-                <w:rtl w:val="false"/>
-              </w:rPr>
-              <w:t xml:space="preserve"/>
-            </w:r>
-          </w:p>
-        </w:tc>
-        <w:tc>
-          <w:tcPr>
-            <w:tcW w:type="dxa" w:w="1805"/>
-            <w:shd w:fill="FFFFFF"/>
-          </w:tcPr>
-          <w:p>
-            <w:pPr>
-              <w:bidi w:val="false"/>
-              <w:jc w:val="left"/>
-            </w:pPr>
-            <w:r>
-              <w:rPr>
-                <w:b w:val="false"/>
-                <w:bCs w:val="false"/>
-                <w:i w:val="false"/>
-                <w:iCs w:val="false"/>
-                <w:color w:val="17242D"/>
-                <w:rtl w:val="false"/>
-              </w:rPr>
-              <w:t xml:space="preserve"/>
-            </w:r>
-          </w:p>
-        </w:tc>
-      </w:tr>
-      <w:tr>
-        <w:trPr>
-          <w:trHeight w:val="454" w:hRule="atLeast"/>
-        </w:trPr>
-        <w:tc>
-          <w:tcPr>
-            <w:tcW w:type="dxa" w:w="1806"/>
-            <w:shd w:fill="FFFFFF"/>
-          </w:tcPr>
-          <w:p>
-            <w:pPr>
-              <w:bidi w:val="false"/>
-              <w:jc w:val="left"/>
-            </w:pPr>
-            <w:r>
-              <w:rPr>
-                <w:b w:val="false"/>
-                <w:bCs w:val="false"/>
-                <w:i w:val="false"/>
-                <w:iCs w:val="false"/>
-                <w:color w:val="17242D"/>
-                <w:rtl w:val="false"/>
-              </w:rPr>
-              <w:t xml:space="preserve">3</w:t>
-            </w:r>
-          </w:p>
-        </w:tc>
-        <w:tc>
-          <w:tcPr>
-            <w:tcW w:type="dxa" w:w="1805"/>
-            <w:shd w:fill="FFFFFF"/>
-          </w:tcPr>
-          <w:p>
-            <w:pPr>
-              <w:bidi w:val="false"/>
-              <w:jc w:val="left"/>
-            </w:pPr>
-            <w:r>
-              <w:rPr>
-                <w:b w:val="false"/>
-                <w:bCs w:val="false"/>
-                <w:i w:val="false"/>
-                <w:iCs w:val="false"/>
-                <w:color w:val="17242D"/>
-                <w:rtl w:val="false"/>
-              </w:rPr>
-              <w:t xml:space="preserve"/>
-            </w:r>
-          </w:p>
-        </w:tc>
-        <w:tc>
-          <w:tcPr>
-            <w:tcW w:type="dxa" w:w="1805"/>
-            <w:shd w:fill="FFFFFF"/>
-          </w:tcPr>
-          <w:p>
-            <w:pPr>
-              <w:bidi w:val="false"/>
-              <w:jc w:val="left"/>
-            </w:pPr>
-            <w:r>
-              <w:rPr>
-                <w:b w:val="false"/>
-                <w:bCs w:val="false"/>
-                <w:i w:val="false"/>
-                <w:iCs w:val="false"/>
-                <w:color w:val="17242D"/>
-                <w:rtl w:val="false"/>
-              </w:rPr>
-              <w:t xml:space="preserve"/>
-            </w:r>
-          </w:p>
-        </w:tc>
-        <w:tc>
-          <w:tcPr>
-            <w:tcW w:type="dxa" w:w="1805"/>
-            <w:shd w:fill="FFFFFF"/>
-          </w:tcPr>
-          <w:p>
-            <w:pPr>
-              <w:bidi w:val="false"/>
-              <w:jc w:val="left"/>
-            </w:pPr>
-            <w:r>
-              <w:rPr>
-                <w:b w:val="false"/>
-                <w:bCs w:val="false"/>
-                <w:i w:val="false"/>
-                <w:iCs w:val="false"/>
-                <w:color w:val="17242D"/>
-                <w:rtl w:val="false"/>
-              </w:rPr>
-              <w:t xml:space="preserve"/>
-            </w:r>
-          </w:p>
-        </w:tc>
-        <w:tc>
-          <w:tcPr>
-            <w:tcW w:type="dxa" w:w="1805"/>
-            <w:shd w:fill="FFFFFF"/>
-          </w:tcPr>
-          <w:p>
-            <w:pPr>
-              <w:bidi w:val="false"/>
-              <w:jc w:val="left"/>
-            </w:pPr>
-            <w:r>
-              <w:rPr>
-                <w:b w:val="false"/>
-                <w:bCs w:val="false"/>
-                <w:i w:val="false"/>
-                <w:iCs w:val="false"/>
-                <w:color w:val="17242D"/>
-                <w:rtl w:val="false"/>
-              </w:rPr>
-              <w:t xml:space="preserve"/>
-            </w:r>
-          </w:p>
-        </w:tc>
-      </w:tr>
-      <w:tr>
-        <w:trPr>
-          <w:trHeight w:val="454" w:hRule="atLeast"/>
-        </w:trPr>
-        <w:tc>
-          <w:tcPr>
-            <w:tcW w:type="dxa" w:w="1806"/>
-            <w:shd w:fill="FFFFFF"/>
-          </w:tcPr>
-          <w:p>
-            <w:pPr>
-              <w:bidi w:val="false"/>
-              <w:jc w:val="left"/>
-            </w:pPr>
-            <w:r>
-              <w:rPr>
-                <w:b w:val="false"/>
-                <w:bCs w:val="false"/>
-                <w:i w:val="false"/>
-                <w:iCs w:val="false"/>
-                <w:color w:val="17242D"/>
-                <w:rtl w:val="false"/>
-              </w:rPr>
-              <w:t xml:space="preserve">4</w:t>
-            </w:r>
-          </w:p>
-        </w:tc>
-        <w:tc>
-          <w:tcPr>
-            <w:tcW w:type="dxa" w:w="1805"/>
-            <w:shd w:fill="FFFFFF"/>
-          </w:tcPr>
-          <w:p>
-            <w:pPr>
-              <w:bidi w:val="false"/>
-              <w:jc w:val="left"/>
-            </w:pPr>
-            <w:r>
-              <w:rPr>
-                <w:b w:val="false"/>
-                <w:bCs w:val="false"/>
-                <w:i w:val="false"/>
-                <w:iCs w:val="false"/>
-                <w:color w:val="17242D"/>
-                <w:rtl w:val="false"/>
-              </w:rPr>
-              <w:t xml:space="preserve"/>
-            </w:r>
-          </w:p>
-        </w:tc>
-        <w:tc>
-          <w:tcPr>
-            <w:tcW w:type="dxa" w:w="1805"/>
-            <w:shd w:fill="FFFFFF"/>
-          </w:tcPr>
-          <w:p>
-            <w:pPr>
-              <w:bidi w:val="false"/>
-              <w:jc w:val="left"/>
-            </w:pPr>
-            <w:r>
-              <w:rPr>
-                <w:b w:val="false"/>
-                <w:bCs w:val="false"/>
-                <w:i w:val="false"/>
-                <w:iCs w:val="false"/>
-                <w:color w:val="17242D"/>
-                <w:rtl w:val="false"/>
-              </w:rPr>
-              <w:t xml:space="preserve"/>
-            </w:r>
-          </w:p>
-        </w:tc>
-        <w:tc>
-          <w:tcPr>
-            <w:tcW w:type="dxa" w:w="1805"/>
-            <w:shd w:fill="FFFFFF"/>
-          </w:tcPr>
-          <w:p>
-            <w:pPr>
-              <w:bidi w:val="false"/>
-              <w:jc w:val="left"/>
-            </w:pPr>
-            <w:r>
-              <w:rPr>
-                <w:b w:val="false"/>
-                <w:bCs w:val="false"/>
-                <w:i w:val="false"/>
-                <w:iCs w:val="false"/>
-                <w:color w:val="17242D"/>
-                <w:rtl w:val="false"/>
-              </w:rPr>
-              <w:t xml:space="preserve"/>
-            </w:r>
-          </w:p>
-        </w:tc>
-        <w:tc>
-          <w:tcPr>
-            <w:tcW w:type="dxa" w:w="1805"/>
-            <w:shd w:fill="FFFFFF"/>
-          </w:tcPr>
-          <w:p>
-            <w:pPr>
-              <w:bidi w:val="false"/>
-              <w:jc w:val="left"/>
-            </w:pPr>
-            <w:r>
-              <w:rPr>
-                <w:b w:val="false"/>
-                <w:bCs w:val="false"/>
-                <w:i w:val="false"/>
-                <w:iCs w:val="false"/>
-                <w:color w:val="17242D"/>
-                <w:rtl w:val="false"/>
-              </w:rPr>
-              <w:t xml:space="preserve"/>
-            </w:r>
-          </w:p>
-        </w:tc>
-      </w:tr>
-      <w:tr>
-        <w:trPr>
-          <w:trHeight w:val="454" w:hRule="atLeast"/>
-        </w:trPr>
-        <w:tc>
-          <w:tcPr>
-            <w:tcW w:type="dxa" w:w="1806"/>
-            <w:shd w:fill="FFFFFF"/>
-          </w:tcPr>
-          <w:p>
-            <w:pPr>
-              <w:bidi w:val="false"/>
-              <w:jc w:val="left"/>
-            </w:pPr>
-            <w:r>
-              <w:rPr>
-                <w:b w:val="false"/>
-                <w:bCs w:val="false"/>
-                <w:i w:val="false"/>
-                <w:iCs w:val="false"/>
-                <w:color w:val="17242D"/>
-                <w:rtl w:val="false"/>
-              </w:rPr>
-              <w:t xml:space="preserve">5</w:t>
-            </w:r>
-          </w:p>
-        </w:tc>
-        <w:tc>
-          <w:tcPr>
-            <w:tcW w:type="dxa" w:w="1805"/>
-            <w:shd w:fill="FFFFFF"/>
-          </w:tcPr>
-          <w:p>
-            <w:pPr>
-              <w:bidi w:val="false"/>
-              <w:jc w:val="left"/>
-            </w:pPr>
-            <w:r>
-              <w:rPr>
-                <w:b w:val="false"/>
-                <w:bCs w:val="false"/>
-                <w:i w:val="false"/>
-                <w:iCs w:val="false"/>
-                <w:color w:val="17242D"/>
-                <w:rtl w:val="false"/>
-              </w:rPr>
-              <w:t xml:space="preserve"/>
-            </w:r>
-          </w:p>
-        </w:tc>
-        <w:tc>
-          <w:tcPr>
-            <w:tcW w:type="dxa" w:w="1805"/>
-            <w:shd w:fill="FFFFFF"/>
-          </w:tcPr>
-          <w:p>
-            <w:pPr>
-              <w:bidi w:val="false"/>
-              <w:jc w:val="left"/>
-            </w:pPr>
-            <w:r>
-              <w:rPr>
-                <w:b w:val="false"/>
-                <w:bCs w:val="false"/>
-                <w:i w:val="false"/>
-                <w:iCs w:val="false"/>
-                <w:color w:val="17242D"/>
-                <w:rtl w:val="false"/>
-              </w:rPr>
-              <w:t xml:space="preserve"/>
-            </w:r>
-          </w:p>
-        </w:tc>
-        <w:tc>
-          <w:tcPr>
-            <w:tcW w:type="dxa" w:w="1805"/>
-            <w:shd w:fill="FFFFFF"/>
-          </w:tcPr>
-          <w:p>
-            <w:pPr>
-              <w:bidi w:val="false"/>
-              <w:jc w:val="left"/>
-            </w:pPr>
-            <w:r>
-              <w:rPr>
-                <w:b w:val="false"/>
-                <w:bCs w:val="false"/>
-                <w:i w:val="false"/>
-                <w:iCs w:val="false"/>
-                <w:color w:val="17242D"/>
-                <w:rtl w:val="false"/>
-              </w:rPr>
-              <w:t xml:space="preserve"/>
-            </w:r>
-          </w:p>
-        </w:tc>
-        <w:tc>
-          <w:tcPr>
-            <w:tcW w:type="dxa" w:w="1805"/>
-            <w:shd w:fill="FFFFFF"/>
-          </w:tcPr>
-          <w:p>
-            <w:pPr>
-              <w:bidi w:val="false"/>
-              <w:jc w:val="left"/>
-            </w:pPr>
-            <w:r>
-              <w:rPr>
-                <w:b w:val="false"/>
-                <w:bCs w:val="false"/>
-                <w:i w:val="false"/>
-                <w:iCs w:val="false"/>
-                <w:color w:val="17242D"/>
-                <w:rtl w:val="false"/>
-              </w:rPr>
-              <w:t xml:space="preserve"/>
-            </w:r>
-          </w:p>
-        </w:tc>
-      </w:tr>
-      <w:tr>
-        <w:trPr>
-          <w:trHeight w:val="454" w:hRule="atLeast"/>
-        </w:trPr>
-        <w:tc>
-          <w:tcPr>
-            <w:tcW w:type="dxa" w:w="1806"/>
-            <w:shd w:fill="FFFFFF"/>
-          </w:tcPr>
-          <w:p>
-            <w:pPr>
-              <w:bidi w:val="false"/>
-              <w:jc w:val="left"/>
-            </w:pPr>
-            <w:r>
-              <w:rPr>
-                <w:b w:val="false"/>
-                <w:bCs w:val="false"/>
-                <w:i w:val="false"/>
-                <w:iCs w:val="false"/>
-                <w:color w:val="17242D"/>
-                <w:rtl w:val="false"/>
-              </w:rPr>
-              <w:t xml:space="preserve">6</w:t>
-            </w:r>
-          </w:p>
-        </w:tc>
-        <w:tc>
-          <w:tcPr>
-            <w:tcW w:type="dxa" w:w="1805"/>
-            <w:shd w:fill="FFFFFF"/>
-          </w:tcPr>
-          <w:p>
-            <w:pPr>
-              <w:bidi w:val="false"/>
-              <w:jc w:val="left"/>
-            </w:pPr>
-            <w:r>
-              <w:rPr>
-                <w:b w:val="false"/>
-                <w:bCs w:val="false"/>
-                <w:i w:val="false"/>
-                <w:iCs w:val="false"/>
-                <w:color w:val="17242D"/>
-                <w:rtl w:val="false"/>
-              </w:rPr>
-              <w:t xml:space="preserve"/>
-            </w:r>
-          </w:p>
-        </w:tc>
-        <w:tc>
-          <w:tcPr>
-            <w:tcW w:type="dxa" w:w="1805"/>
-            <w:shd w:fill="FFFFFF"/>
-          </w:tcPr>
-          <w:p>
-            <w:pPr>
-              <w:bidi w:val="false"/>
-              <w:jc w:val="left"/>
-            </w:pPr>
-            <w:r>
-              <w:rPr>
-                <w:b w:val="false"/>
-                <w:bCs w:val="false"/>
-                <w:i w:val="false"/>
-                <w:iCs w:val="false"/>
-                <w:color w:val="17242D"/>
-                <w:rtl w:val="false"/>
-              </w:rPr>
-              <w:t xml:space="preserve"/>
-            </w:r>
-          </w:p>
-        </w:tc>
-        <w:tc>
-          <w:tcPr>
-            <w:tcW w:type="dxa" w:w="1805"/>
-            <w:shd w:fill="FFFFFF"/>
-          </w:tcPr>
-          <w:p>
-            <w:pPr>
-              <w:bidi w:val="false"/>
-              <w:jc w:val="left"/>
-            </w:pPr>
-            <w:r>
-              <w:rPr>
-                <w:b w:val="false"/>
-                <w:bCs w:val="false"/>
-                <w:i w:val="false"/>
-                <w:iCs w:val="false"/>
-                <w:color w:val="17242D"/>
-                <w:rtl w:val="false"/>
-              </w:rPr>
-              <w:t xml:space="preserve"/>
-            </w:r>
-          </w:p>
-        </w:tc>
-        <w:tc>
-          <w:tcPr>
-            <w:tcW w:type="dxa" w:w="1805"/>
-            <w:shd w:fill="FFFFFF"/>
-          </w:tcPr>
-          <w:p>
-            <w:pPr>
-              <w:bidi w:val="false"/>
-              <w:jc w:val="left"/>
-            </w:pPr>
-            <w:r>
-              <w:rPr>
-                <w:b w:val="false"/>
-                <w:bCs w:val="false"/>
-                <w:i w:val="false"/>
-                <w:iCs w:val="false"/>
-                <w:color w:val="17242D"/>
-                <w:rtl w:val="false"/>
-              </w:rPr>
-              <w:t xml:space="preserve"/>
-            </w:r>
-          </w:p>
-        </w:tc>
-      </w:tr>
-    </w:tbl>
-    <w:p>
-      <w:pPr>
-        <w:pStyle w:val="Heading1"/>
-        <w:shd w:fill="F0EAFA"/>
-        <w:bidi w:val="false"/>
-        <w:spacing w:after="100" w:before="200"/>
-        <w:jc w:val="left"/>
-      </w:pPr>
-      <w:r>
-        <w:rPr>
-          <w:b/>
-          <w:bCs/>
-          <w:color w:val="4E356F"/>
-          <w:rtl w:val="false"/>
-        </w:rPr>
-        <w:t xml:space="preserve">3. Review for truth and clarity</w:t>
-      </w:r>
-    </w:p>
-    <w:p>
-      <w:pPr>
-        <w:bidi w:val="false"/>
-        <w:jc w:val="left"/>
-      </w:pPr>
-      <w:r>
-        <w:rPr>
-          <w:b w:val="false"/>
-          <w:bCs w:val="false"/>
-          <w:color w:val="17242D"/>
-          <w:rtl w:val="false"/>
-        </w:rPr>
-        <w:t xml:space="preserve">Go through the story item by item and ask what a viewer might wrongly conclude. A generated image that is not labelled is not decoration — it is a claim.</w:t>
-      </w:r>
-    </w:p>
-    <w:tbl>
-      <w:tblPr>
-        <w:bidiVisual w:val="false"/>
-        <w:tblW w:type="dxa" w:w="9026"/>
-        <w:tblBorders>
-          <w:top w:val="single" w:color="auto" w:sz="4"/>
-          <w:left w:val="single" w:color="auto" w:sz="4"/>
-          <w:bottom w:val="single" w:color="auto" w:sz="4"/>
-          <w:right w:val="single" w:color="auto" w:sz="4"/>
-          <w:insideH w:val="single" w:color="auto" w:sz="4"/>
-          <w:insideV w:val="single" w:color="auto" w:sz="4"/>
-        </w:tblBorders>
-        <w:tblLayout w:type="fixed"/>
-      </w:tblPr>
-      <w:tblGrid>
-        <w:gridCol w:w="2258"/>
-        <w:gridCol w:w="2256"/>
-        <w:gridCol w:w="2256"/>
-        <w:gridCol w:w="2256"/>
-      </w:tblGrid>
-      <w:tr>
-        <w:tc>
-          <w:tcPr>
-            <w:tcW w:type="dxa" w:w="2258"/>
-            <w:shd w:fill="4E356F"/>
-          </w:tcPr>
-          <w:p>
-            <w:pPr>
-              <w:bidi w:val="false"/>
-              <w:jc w:val="left"/>
-            </w:pPr>
-            <w:r>
-              <w:rPr>
-                <w:b/>
-                <w:bCs/>
-                <w:i w:val="false"/>
-                <w:iCs w:val="false"/>
-                <w:color w:val="FFFFFF"/>
-                <w:rtl w:val="false"/>
-              </w:rPr>
-              <w:t xml:space="preserve">Item in the story</w:t>
-            </w:r>
-          </w:p>
-        </w:tc>
-        <w:tc>
-          <w:tcPr>
-            <w:tcW w:type="dxa" w:w="2256"/>
-            <w:shd w:fill="4E356F"/>
-          </w:tcPr>
-          <w:p>
-            <w:pPr>
-              <w:bidi w:val="false"/>
-              <w:jc w:val="left"/>
-            </w:pPr>
-            <w:r>
-              <w:rPr>
-                <w:b/>
-                <w:bCs/>
-                <w:i w:val="false"/>
-                <w:iCs w:val="false"/>
-                <w:color w:val="FFFFFF"/>
-                <w:rtl w:val="false"/>
-              </w:rPr>
-              <w:t xml:space="preserve">Original, edited, or generated?</w:t>
-            </w:r>
-          </w:p>
-        </w:tc>
-        <w:tc>
-          <w:tcPr>
-            <w:tcW w:type="dxa" w:w="2256"/>
-            <w:shd w:fill="4E356F"/>
-          </w:tcPr>
-          <w:p>
-            <w:pPr>
-              <w:bidi w:val="false"/>
-              <w:jc w:val="left"/>
-            </w:pPr>
-            <w:r>
-              <w:rPr>
-                <w:b/>
-                <w:bCs/>
-                <w:i w:val="false"/>
-                <w:iCs w:val="false"/>
-                <w:color w:val="FFFFFF"/>
-                <w:rtl w:val="false"/>
-              </w:rPr>
-              <w:t xml:space="preserve">What a viewer might wrongly think</w:t>
-            </w:r>
-          </w:p>
-        </w:tc>
-        <w:tc>
-          <w:tcPr>
-            <w:tcW w:type="dxa" w:w="2256"/>
-            <w:shd w:fill="4E356F"/>
-          </w:tcPr>
-          <w:p>
-            <w:pPr>
-              <w:bidi w:val="false"/>
-              <w:jc w:val="left"/>
-            </w:pPr>
-            <w:r>
-              <w:rPr>
-                <w:b/>
-                <w:bCs/>
-                <w:i w:val="false"/>
-                <w:iCs w:val="false"/>
-                <w:color w:val="FFFFFF"/>
-                <w:rtl w:val="false"/>
-              </w:rPr>
-              <w:t xml:space="preserve">What I added to prevent that</w:t>
-            </w:r>
-          </w:p>
-        </w:tc>
-      </w:tr>
-      <w:tr>
-        <w:trPr>
-          <w:trHeight w:val="454" w:hRule="atLeast"/>
-        </w:trPr>
-        <w:tc>
-          <w:tcPr>
-            <w:tcW w:type="dxa" w:w="2258"/>
-            <w:shd w:fill="F1F3F6"/>
-          </w:tcPr>
-          <w:p>
-            <w:pPr>
-              <w:bidi w:val="false"/>
-              <w:jc w:val="left"/>
-            </w:pPr>
-            <w:r>
-              <w:rPr>
-                <w:b w:val="false"/>
-                <w:bCs w:val="false"/>
-                <w:i/>
-                <w:iCs/>
-                <w:color w:val="55606E"/>
-                <w:rtl w:val="false"/>
-              </w:rPr>
-              <w:t xml:space="preserve">Example: the neighbourhood background image</w:t>
-            </w:r>
-          </w:p>
-        </w:tc>
-        <w:tc>
-          <w:tcPr>
-            <w:tcW w:type="dxa" w:w="2256"/>
-            <w:shd w:fill="F1F3F6"/>
-          </w:tcPr>
-          <w:p>
-            <w:pPr>
-              <w:bidi w:val="false"/>
-              <w:jc w:val="left"/>
-            </w:pPr>
-            <w:r>
-              <w:rPr>
-                <w:b w:val="false"/>
-                <w:bCs w:val="false"/>
-                <w:i/>
-                <w:iCs/>
-                <w:color w:val="55606E"/>
-                <w:rtl w:val="false"/>
-              </w:rPr>
-              <w:t xml:space="preserve">AI generated</w:t>
-            </w:r>
-          </w:p>
-        </w:tc>
-        <w:tc>
-          <w:tcPr>
-            <w:tcW w:type="dxa" w:w="2256"/>
-            <w:shd w:fill="F1F3F6"/>
-          </w:tcPr>
-          <w:p>
-            <w:pPr>
-              <w:bidi w:val="false"/>
-              <w:jc w:val="left"/>
-            </w:pPr>
-            <w:r>
-              <w:rPr>
-                <w:b w:val="false"/>
-                <w:bCs w:val="false"/>
-                <w:i/>
-                <w:iCs/>
-                <w:color w:val="55606E"/>
-                <w:rtl w:val="false"/>
-              </w:rPr>
-              <w:t xml:space="preserve">That it is a real photograph of the street the story is about</w:t>
-            </w:r>
-          </w:p>
-        </w:tc>
-        <w:tc>
-          <w:tcPr>
-            <w:tcW w:type="dxa" w:w="2256"/>
-            <w:shd w:fill="F1F3F6"/>
-          </w:tcPr>
-          <w:p>
-            <w:pPr>
-              <w:bidi w:val="false"/>
-              <w:jc w:val="left"/>
-            </w:pPr>
-            <w:r>
-              <w:rPr>
-                <w:b w:val="false"/>
-                <w:bCs w:val="false"/>
-                <w:i/>
-                <w:iCs/>
-                <w:color w:val="55606E"/>
-                <w:rtl w:val="false"/>
-              </w:rPr>
-              <w:t xml:space="preserve">A “illustration, not a photograph” caption and alt text saying the same</w:t>
-            </w:r>
-          </w:p>
-        </w:tc>
-      </w:tr>
-      <w:tr>
-        <w:trPr>
-          <w:trHeight w:val="454" w:hRule="atLeast"/>
-        </w:trPr>
-        <w:tc>
-          <w:tcPr>
-            <w:tcW w:type="dxa" w:w="2258"/>
-            <w:shd w:fill="FFFFFF"/>
-          </w:tcPr>
-          <w:p>
-            <w:pPr>
-              <w:bidi w:val="false"/>
-              <w:jc w:val="left"/>
-            </w:pPr>
-            <w:r>
-              <w:rPr>
-                <w:b w:val="false"/>
-                <w:bCs w:val="false"/>
-                <w:i w:val="false"/>
-                <w:iCs w:val="false"/>
-                <w:color w:val="17242D"/>
-                <w:rtl w:val="false"/>
-              </w:rPr>
-              <w:t xml:space="preserve"/>
-            </w:r>
-          </w:p>
-        </w:tc>
-        <w:tc>
-          <w:tcPr>
-            <w:tcW w:type="dxa" w:w="2256"/>
-            <w:shd w:fill="FFFFFF"/>
-          </w:tcPr>
-          <w:p>
-            <w:pPr>
-              <w:bidi w:val="false"/>
-              <w:jc w:val="left"/>
-            </w:pPr>
-            <w:r>
-              <w:rPr>
-                <w:b w:val="false"/>
-                <w:bCs w:val="false"/>
-                <w:i w:val="false"/>
-                <w:iCs w:val="false"/>
-                <w:color w:val="17242D"/>
-                <w:rtl w:val="false"/>
-              </w:rPr>
-              <w:t xml:space="preserve"/>
-            </w:r>
-          </w:p>
-        </w:tc>
-        <w:tc>
-          <w:tcPr>
-            <w:tcW w:type="dxa" w:w="2256"/>
-            <w:shd w:fill="FFFFFF"/>
-          </w:tcPr>
-          <w:p>
-            <w:pPr>
-              <w:bidi w:val="false"/>
-              <w:jc w:val="left"/>
-            </w:pPr>
-            <w:r>
-              <w:rPr>
-                <w:b w:val="false"/>
-                <w:bCs w:val="false"/>
-                <w:i w:val="false"/>
-                <w:iCs w:val="false"/>
-                <w:color w:val="17242D"/>
-                <w:rtl w:val="false"/>
-              </w:rPr>
-              <w:t xml:space="preserve"/>
-            </w:r>
-          </w:p>
-        </w:tc>
-        <w:tc>
-          <w:tcPr>
-            <w:tcW w:type="dxa" w:w="2256"/>
-            <w:shd w:fill="FFFFFF"/>
-          </w:tcPr>
-          <w:p>
-            <w:pPr>
-              <w:bidi w:val="false"/>
-              <w:jc w:val="left"/>
-            </w:pPr>
-            <w:r>
-              <w:rPr>
-                <w:b w:val="false"/>
-                <w:bCs w:val="false"/>
-                <w:i w:val="false"/>
-                <w:iCs w:val="false"/>
-                <w:color w:val="17242D"/>
-                <w:rtl w:val="false"/>
-              </w:rPr>
-              <w:t xml:space="preserve"/>
-            </w:r>
-          </w:p>
-        </w:tc>
-      </w:tr>
-      <w:tr>
-        <w:trPr>
-          <w:trHeight w:val="454" w:hRule="atLeast"/>
-        </w:trPr>
-        <w:tc>
-          <w:tcPr>
-            <w:tcW w:type="dxa" w:w="2258"/>
-            <w:shd w:fill="FFFFFF"/>
-          </w:tcPr>
-          <w:p>
-            <w:pPr>
-              <w:bidi w:val="false"/>
-              <w:jc w:val="left"/>
-            </w:pPr>
-            <w:r>
-              <w:rPr>
-                <w:b w:val="false"/>
-                <w:bCs w:val="false"/>
-                <w:i w:val="false"/>
-                <w:iCs w:val="false"/>
-                <w:color w:val="17242D"/>
-                <w:rtl w:val="false"/>
-              </w:rPr>
-              <w:t xml:space="preserve"/>
-            </w:r>
-          </w:p>
-        </w:tc>
-        <w:tc>
-          <w:tcPr>
-            <w:tcW w:type="dxa" w:w="2256"/>
-            <w:shd w:fill="FFFFFF"/>
-          </w:tcPr>
-          <w:p>
-            <w:pPr>
-              <w:bidi w:val="false"/>
-              <w:jc w:val="left"/>
-            </w:pPr>
-            <w:r>
-              <w:rPr>
-                <w:b w:val="false"/>
-                <w:bCs w:val="false"/>
-                <w:i w:val="false"/>
-                <w:iCs w:val="false"/>
-                <w:color w:val="17242D"/>
-                <w:rtl w:val="false"/>
-              </w:rPr>
-              <w:t xml:space="preserve"/>
-            </w:r>
-          </w:p>
-        </w:tc>
-        <w:tc>
-          <w:tcPr>
-            <w:tcW w:type="dxa" w:w="2256"/>
-            <w:shd w:fill="FFFFFF"/>
-          </w:tcPr>
-          <w:p>
-            <w:pPr>
-              <w:bidi w:val="false"/>
-              <w:jc w:val="left"/>
-            </w:pPr>
-            <w:r>
-              <w:rPr>
-                <w:b w:val="false"/>
-                <w:bCs w:val="false"/>
-                <w:i w:val="false"/>
-                <w:iCs w:val="false"/>
-                <w:color w:val="17242D"/>
-                <w:rtl w:val="false"/>
-              </w:rPr>
-              <w:t xml:space="preserve"/>
-            </w:r>
-          </w:p>
-        </w:tc>
-        <w:tc>
-          <w:tcPr>
-            <w:tcW w:type="dxa" w:w="2256"/>
-            <w:shd w:fill="FFFFFF"/>
-          </w:tcPr>
-          <w:p>
-            <w:pPr>
-              <w:bidi w:val="false"/>
-              <w:jc w:val="left"/>
-            </w:pPr>
-            <w:r>
-              <w:rPr>
-                <w:b w:val="false"/>
-                <w:bCs w:val="false"/>
-                <w:i w:val="false"/>
-                <w:iCs w:val="false"/>
-                <w:color w:val="17242D"/>
-                <w:rtl w:val="false"/>
-              </w:rPr>
-              <w:t xml:space="preserve"/>
-            </w:r>
-          </w:p>
-        </w:tc>
-      </w:tr>
-      <w:tr>
-        <w:trPr>
-          <w:trHeight w:val="454" w:hRule="atLeast"/>
-        </w:trPr>
-        <w:tc>
-          <w:tcPr>
-            <w:tcW w:type="dxa" w:w="2258"/>
-            <w:shd w:fill="FFFFFF"/>
-          </w:tcPr>
-          <w:p>
-            <w:pPr>
-              <w:bidi w:val="false"/>
-              <w:jc w:val="left"/>
-            </w:pPr>
-            <w:r>
-              <w:rPr>
-                <w:b w:val="false"/>
-                <w:bCs w:val="false"/>
-                <w:i w:val="false"/>
-                <w:iCs w:val="false"/>
-                <w:color w:val="17242D"/>
-                <w:rtl w:val="false"/>
-              </w:rPr>
-              <w:t xml:space="preserve"/>
-            </w:r>
-          </w:p>
-        </w:tc>
-        <w:tc>
-          <w:tcPr>
-            <w:tcW w:type="dxa" w:w="2256"/>
-            <w:shd w:fill="FFFFFF"/>
-          </w:tcPr>
-          <w:p>
-            <w:pPr>
-              <w:bidi w:val="false"/>
-              <w:jc w:val="left"/>
-            </w:pPr>
-            <w:r>
-              <w:rPr>
-                <w:b w:val="false"/>
-                <w:bCs w:val="false"/>
-                <w:i w:val="false"/>
-                <w:iCs w:val="false"/>
-                <w:color w:val="17242D"/>
-                <w:rtl w:val="false"/>
-              </w:rPr>
-              <w:t xml:space="preserve"/>
-            </w:r>
-          </w:p>
-        </w:tc>
-        <w:tc>
-          <w:tcPr>
-            <w:tcW w:type="dxa" w:w="2256"/>
-            <w:shd w:fill="FFFFFF"/>
-          </w:tcPr>
-          <w:p>
-            <w:pPr>
-              <w:bidi w:val="false"/>
-              <w:jc w:val="left"/>
-            </w:pPr>
-            <w:r>
-              <w:rPr>
-                <w:b w:val="false"/>
-                <w:bCs w:val="false"/>
-                <w:i w:val="false"/>
-                <w:iCs w:val="false"/>
-                <w:color w:val="17242D"/>
-                <w:rtl w:val="false"/>
-              </w:rPr>
-              <w:t xml:space="preserve"/>
-            </w:r>
-          </w:p>
-        </w:tc>
-        <w:tc>
-          <w:tcPr>
-            <w:tcW w:type="dxa" w:w="2256"/>
             <w:shd w:fill="FFFFFF"/>
           </w:tcPr>
           <w:p>
@@ -22150,7 +21743,7 @@
           <w:color w:val="17242D"/>
           <w:rtl w:val="false"/>
         </w:rPr>
-        <w:t xml:space="preserve">Make a short visual story whose audience can tell what is real, what was edited, and what a machine made.</w:t>
+        <w:t xml:space="preserve">Carry one idea through the whole pipeline — a generated image, a fix, an animated clip of your own image, a second clip generated from text alone, a narration, and a deck assembled two ways — labelling every generated piece as you go.</w:t>
       </w:r>
     </w:p>
     <w:p>
@@ -22183,7 +21776,7 @@
           <w:color w:val="17242D"/>
           <w:rtl w:val="false"/>
         </w:rPr>
-        <w:t xml:space="preserve">1. Decide the audience, main message, source assets, and permissions (for example: a neighbourhood group, a club, your family, a class).</w:t>
+        <w:t xml:space="preserve">1. Pick one subject and audience, and write what the piece must say (for example: a product idea, a family announcement, a short lesson).</w:t>
       </w:r>
     </w:p>
     <w:p>
@@ -22198,7 +21791,7 @@
           <w:color w:val="17242D"/>
           <w:rtl w:val="false"/>
         </w:rPr>
-        <w:t xml:space="preserve">2. Fill in the storyboard with captions and accessibility notes.</w:t>
+        <w:t xml:space="preserve">2. Generate an image and fix it in Gemini (or compare it against ChatGPT), animate it and generate a second clip from text alone in Gemini, narrate it in Google AI Studio, then assemble the deck in Claude and Canva — logging the tool, prompt, and result at each stage.</w:t>
       </w:r>
     </w:p>
     <w:p>
@@ -22213,7 +21806,7 @@
           <w:color w:val="17242D"/>
           <w:rtl w:val="false"/>
         </w:rPr>
-        <w:t xml:space="preserve">3. Fact-check one claim that would matter if it were wrong, and add every label the audience needs.</w:t>
+        <w:t xml:space="preserve">3. Compare at least two tools at the generate and fix stages, then label every generated piece before you show it to anyone.</w:t>
       </w:r>
     </w:p>
     <w:p>
@@ -22354,7 +21947,7 @@
                 <w:color w:val="17242D"/>
                 <w:rtl w:val="false"/>
               </w:rPr>
-              <w:t xml:space="preserve">Create a short storyboard with sources and labels.</w:t>
+              <w:t xml:space="preserve">Complete the full six-stage chain — image, fix, animation, text-to-clip, narration, assembled deck — with every generated piece labelled.</w:t>
             </w:r>
           </w:p>
         </w:tc>
@@ -22402,7 +21995,7 @@
                 <w:color w:val="17242D"/>
                 <w:rtl w:val="false"/>
               </w:rPr>
-              <w:t xml:space="preserve">Produce the visual story with accessibility notes and fact checks (for example: alternative text on every image, and a visible "AI-generated illustration" label).</w:t>
+              <w:t xml:space="preserve">Add a tool comparison at the generate and fix stages (stages 1–2), and a working narration synced to the deck.</w:t>
             </w:r>
           </w:p>
         </w:tc>
@@ -22450,7 +22043,7 @@
                 <w:color w:val="17242D"/>
                 <w:rtl w:val="false"/>
               </w:rPr>
-              <w:t xml:space="preserve">Show it to a member of the intended audience and revise for clarity or trust.</w:t>
+              <w:t xml:space="preserve">Show the finished deck to someone from the intended audience, and revise it from what they tell you.</w:t>
             </w:r>
           </w:p>
         </w:tc>
@@ -22610,7 +22203,7 @@
                 <w:color w:val="55606E"/>
                 <w:rtl w:val="false"/>
               </w:rPr>
-              <w:t xml:space="preserve">The video about the running route</w:t>
+              <w:t xml:space="preserve">The morning-walk deck for my family</w:t>
             </w:r>
           </w:p>
         </w:tc>
@@ -22633,7 +22226,7 @@
                 <w:color w:val="55606E"/>
                 <w:rtl w:val="false"/>
               </w:rPr>
-              <w:t xml:space="preserve">Before Friday's run</w:t>
+              <w:t xml:space="preserve">Before the weekend</w:t>
             </w:r>
           </w:p>
         </w:tc>
@@ -22728,7 +22321,7 @@
           <w:color w:val="4E356F"/>
           <w:rtl w:val="false"/>
         </w:rPr>
-        <w:t xml:space="preserve">Storyboard, for the real story</w:t>
+        <w:t xml:space="preserve">Stage log, for the real piece</w:t>
       </w:r>
     </w:p>
     <w:tbl>
@@ -22746,16 +22339,17 @@
         <w:tblLayout w:type="fixed"/>
       </w:tblPr>
       <w:tblGrid>
-        <w:gridCol w:w="1806"/>
-        <w:gridCol w:w="1805"/>
-        <w:gridCol w:w="1805"/>
-        <w:gridCol w:w="1805"/>
-        <w:gridCol w:w="1805"/>
+        <w:gridCol w:w="1506"/>
+        <w:gridCol w:w="1504"/>
+        <w:gridCol w:w="1504"/>
+        <w:gridCol w:w="1504"/>
+        <w:gridCol w:w="1504"/>
+        <w:gridCol w:w="1504"/>
       </w:tblGrid>
       <w:tr>
         <w:tc>
           <w:tcPr>
-            <w:tcW w:type="dxa" w:w="1806"/>
+            <w:tcW w:type="dxa" w:w="1506"/>
             <w:shd w:fill="4E356F"/>
           </w:tcPr>
           <w:p>
@@ -22772,13 +22366,13 @@
                 <w:color w:val="FFFFFF"/>
                 <w:rtl w:val="false"/>
               </w:rPr>
-              <w:t xml:space="preserve">Frame</w:t>
-            </w:r>
-          </w:p>
-        </w:tc>
-        <w:tc>
-          <w:tcPr>
-            <w:tcW w:type="dxa" w:w="1805"/>
+              <w:t xml:space="preserve">Stage</w:t>
+            </w:r>
+          </w:p>
+        </w:tc>
+        <w:tc>
+          <w:tcPr>
+            <w:tcW w:type="dxa" w:w="1504"/>
             <w:shd w:fill="4E356F"/>
           </w:tcPr>
           <w:p>
@@ -22795,13 +22389,13 @@
                 <w:color w:val="FFFFFF"/>
                 <w:rtl w:val="false"/>
               </w:rPr>
-              <w:t xml:space="preserve">What the audience sees</w:t>
-            </w:r>
-          </w:p>
-        </w:tc>
-        <w:tc>
-          <w:tcPr>
-            <w:tcW w:type="dxa" w:w="1805"/>
+              <w:t xml:space="preserve">Tool</w:t>
+            </w:r>
+          </w:p>
+        </w:tc>
+        <w:tc>
+          <w:tcPr>
+            <w:tcW w:type="dxa" w:w="1504"/>
             <w:shd w:fill="4E356F"/>
           </w:tcPr>
           <w:p>
@@ -22818,13 +22412,13 @@
                 <w:color w:val="FFFFFF"/>
                 <w:rtl w:val="false"/>
               </w:rPr>
-              <w:t xml:space="preserve">Caption / voice</w:t>
-            </w:r>
-          </w:p>
-        </w:tc>
-        <w:tc>
-          <w:tcPr>
-            <w:tcW w:type="dxa" w:w="1805"/>
+              <w:t xml:space="preserve">Prompt or setting</w:t>
+            </w:r>
+          </w:p>
+        </w:tc>
+        <w:tc>
+          <w:tcPr>
+            <w:tcW w:type="dxa" w:w="1504"/>
             <w:shd w:fill="4E356F"/>
           </w:tcPr>
           <w:p>
@@ -22841,13 +22435,13 @@
                 <w:color w:val="FFFFFF"/>
                 <w:rtl w:val="false"/>
               </w:rPr>
-              <w:t xml:space="preserve">Accessibility note</w:t>
-            </w:r>
-          </w:p>
-        </w:tc>
-        <w:tc>
-          <w:tcPr>
-            <w:tcW w:type="dxa" w:w="1805"/>
+              <w:t xml:space="preserve">What came back</w:t>
+            </w:r>
+          </w:p>
+        </w:tc>
+        <w:tc>
+          <w:tcPr>
+            <w:tcW w:type="dxa" w:w="1504"/>
             <w:shd w:fill="4E356F"/>
           </w:tcPr>
           <w:p>
@@ -22864,7 +22458,30 @@
                 <w:color w:val="FFFFFF"/>
                 <w:rtl w:val="false"/>
               </w:rPr>
-              <w:t xml:space="preserve">Label needed?</w:t>
+              <w:t xml:space="preserve">What I fixed</w:t>
+            </w:r>
+          </w:p>
+        </w:tc>
+        <w:tc>
+          <w:tcPr>
+            <w:tcW w:type="dxa" w:w="1504"/>
+            <w:shd w:fill="4E356F"/>
+          </w:tcPr>
+          <w:p>
+            <w:pPr>
+              <w:bidi w:val="false"/>
+              <w:jc w:val="left"/>
+            </w:pPr>
+            <w:r>
+              <w:rPr>
+                <w:b/>
+                <w:bCs/>
+                <w:i w:val="false"/>
+                <w:iCs w:val="false"/>
+                <w:color w:val="FFFFFF"/>
+                <w:rtl w:val="false"/>
+              </w:rPr>
+              <w:t xml:space="preserve">Labelled?</w:t>
             </w:r>
           </w:p>
         </w:tc>
@@ -22875,99 +22492,122 @@
         </w:trPr>
         <w:tc>
           <w:tcPr>
-            <w:tcW w:type="dxa" w:w="1806"/>
-            <w:shd w:fill="FFFFFF"/>
-          </w:tcPr>
-          <w:p>
-            <w:pPr>
-              <w:bidi w:val="false"/>
-              <w:jc w:val="left"/>
-            </w:pPr>
-            <w:r>
-              <w:rPr>
-                <w:b w:val="false"/>
-                <w:bCs w:val="false"/>
-                <w:i w:val="false"/>
-                <w:iCs w:val="false"/>
-                <w:color w:val="17242D"/>
-                <w:rtl w:val="false"/>
-              </w:rPr>
-              <w:t xml:space="preserve">1</w:t>
-            </w:r>
-          </w:p>
-        </w:tc>
-        <w:tc>
-          <w:tcPr>
-            <w:tcW w:type="dxa" w:w="1805"/>
-            <w:shd w:fill="FFFFFF"/>
-          </w:tcPr>
-          <w:p>
-            <w:pPr>
-              <w:bidi w:val="false"/>
-              <w:jc w:val="left"/>
-            </w:pPr>
-            <w:r>
-              <w:rPr>
-                <w:b w:val="false"/>
-                <w:bCs w:val="false"/>
-                <w:i w:val="false"/>
-                <w:iCs w:val="false"/>
-                <w:color w:val="17242D"/>
-                <w:rtl w:val="false"/>
-              </w:rPr>
-              <w:t xml:space="preserve"/>
-            </w:r>
-          </w:p>
-        </w:tc>
-        <w:tc>
-          <w:tcPr>
-            <w:tcW w:type="dxa" w:w="1805"/>
-            <w:shd w:fill="FFFFFF"/>
-          </w:tcPr>
-          <w:p>
-            <w:pPr>
-              <w:bidi w:val="false"/>
-              <w:jc w:val="left"/>
-            </w:pPr>
-            <w:r>
-              <w:rPr>
-                <w:b w:val="false"/>
-                <w:bCs w:val="false"/>
-                <w:i w:val="false"/>
-                <w:iCs w:val="false"/>
-                <w:color w:val="17242D"/>
-                <w:rtl w:val="false"/>
-              </w:rPr>
-              <w:t xml:space="preserve"/>
-            </w:r>
-          </w:p>
-        </w:tc>
-        <w:tc>
-          <w:tcPr>
-            <w:tcW w:type="dxa" w:w="1805"/>
-            <w:shd w:fill="FFFFFF"/>
-          </w:tcPr>
-          <w:p>
-            <w:pPr>
-              <w:bidi w:val="false"/>
-              <w:jc w:val="left"/>
-            </w:pPr>
-            <w:r>
-              <w:rPr>
-                <w:b w:val="false"/>
-                <w:bCs w:val="false"/>
-                <w:i w:val="false"/>
-                <w:iCs w:val="false"/>
-                <w:color w:val="17242D"/>
-                <w:rtl w:val="false"/>
-              </w:rPr>
-              <w:t xml:space="preserve"/>
-            </w:r>
-          </w:p>
-        </w:tc>
-        <w:tc>
-          <w:tcPr>
-            <w:tcW w:type="dxa" w:w="1805"/>
+            <w:tcW w:type="dxa" w:w="1506"/>
+            <w:shd w:fill="FFFFFF"/>
+          </w:tcPr>
+          <w:p>
+            <w:pPr>
+              <w:bidi w:val="false"/>
+              <w:jc w:val="left"/>
+            </w:pPr>
+            <w:r>
+              <w:rPr>
+                <w:b w:val="false"/>
+                <w:bCs w:val="false"/>
+                <w:i w:val="false"/>
+                <w:iCs w:val="false"/>
+                <w:color w:val="17242D"/>
+                <w:rtl w:val="false"/>
+              </w:rPr>
+              <w:t xml:space="preserve">1 Generate</w:t>
+            </w:r>
+          </w:p>
+        </w:tc>
+        <w:tc>
+          <w:tcPr>
+            <w:tcW w:type="dxa" w:w="1504"/>
+            <w:shd w:fill="FFFFFF"/>
+          </w:tcPr>
+          <w:p>
+            <w:pPr>
+              <w:bidi w:val="false"/>
+              <w:jc w:val="left"/>
+            </w:pPr>
+            <w:r>
+              <w:rPr>
+                <w:b w:val="false"/>
+                <w:bCs w:val="false"/>
+                <w:i w:val="false"/>
+                <w:iCs w:val="false"/>
+                <w:color w:val="17242D"/>
+                <w:rtl w:val="false"/>
+              </w:rPr>
+              <w:t xml:space="preserve"/>
+            </w:r>
+          </w:p>
+        </w:tc>
+        <w:tc>
+          <w:tcPr>
+            <w:tcW w:type="dxa" w:w="1504"/>
+            <w:shd w:fill="FFFFFF"/>
+          </w:tcPr>
+          <w:p>
+            <w:pPr>
+              <w:bidi w:val="false"/>
+              <w:jc w:val="left"/>
+            </w:pPr>
+            <w:r>
+              <w:rPr>
+                <w:b w:val="false"/>
+                <w:bCs w:val="false"/>
+                <w:i w:val="false"/>
+                <w:iCs w:val="false"/>
+                <w:color w:val="17242D"/>
+                <w:rtl w:val="false"/>
+              </w:rPr>
+              <w:t xml:space="preserve"/>
+            </w:r>
+          </w:p>
+        </w:tc>
+        <w:tc>
+          <w:tcPr>
+            <w:tcW w:type="dxa" w:w="1504"/>
+            <w:shd w:fill="FFFFFF"/>
+          </w:tcPr>
+          <w:p>
+            <w:pPr>
+              <w:bidi w:val="false"/>
+              <w:jc w:val="left"/>
+            </w:pPr>
+            <w:r>
+              <w:rPr>
+                <w:b w:val="false"/>
+                <w:bCs w:val="false"/>
+                <w:i w:val="false"/>
+                <w:iCs w:val="false"/>
+                <w:color w:val="17242D"/>
+                <w:rtl w:val="false"/>
+              </w:rPr>
+              <w:t xml:space="preserve"/>
+            </w:r>
+          </w:p>
+        </w:tc>
+        <w:tc>
+          <w:tcPr>
+            <w:tcW w:type="dxa" w:w="1504"/>
+            <w:shd w:fill="FFFFFF"/>
+          </w:tcPr>
+          <w:p>
+            <w:pPr>
+              <w:bidi w:val="false"/>
+              <w:jc w:val="left"/>
+            </w:pPr>
+            <w:r>
+              <w:rPr>
+                <w:b w:val="false"/>
+                <w:bCs w:val="false"/>
+                <w:i w:val="false"/>
+                <w:iCs w:val="false"/>
+                <w:color w:val="17242D"/>
+                <w:rtl w:val="false"/>
+              </w:rPr>
+              <w:t xml:space="preserve"/>
+            </w:r>
+          </w:p>
+        </w:tc>
+        <w:tc>
+          <w:tcPr>
+            <w:tcW w:type="dxa" w:w="1504"/>
             <w:shd w:fill="FFFFFF"/>
           </w:tcPr>
           <w:p>
@@ -22995,99 +22635,122 @@
         </w:trPr>
         <w:tc>
           <w:tcPr>
-            <w:tcW w:type="dxa" w:w="1806"/>
-            <w:shd w:fill="FFFFFF"/>
-          </w:tcPr>
-          <w:p>
-            <w:pPr>
-              <w:bidi w:val="false"/>
-              <w:jc w:val="left"/>
-            </w:pPr>
-            <w:r>
-              <w:rPr>
-                <w:b w:val="false"/>
-                <w:bCs w:val="false"/>
-                <w:i w:val="false"/>
-                <w:iCs w:val="false"/>
-                <w:color w:val="17242D"/>
-                <w:rtl w:val="false"/>
-              </w:rPr>
-              <w:t xml:space="preserve">2</w:t>
-            </w:r>
-          </w:p>
-        </w:tc>
-        <w:tc>
-          <w:tcPr>
-            <w:tcW w:type="dxa" w:w="1805"/>
-            <w:shd w:fill="FFFFFF"/>
-          </w:tcPr>
-          <w:p>
-            <w:pPr>
-              <w:bidi w:val="false"/>
-              <w:jc w:val="left"/>
-            </w:pPr>
-            <w:r>
-              <w:rPr>
-                <w:b w:val="false"/>
-                <w:bCs w:val="false"/>
-                <w:i w:val="false"/>
-                <w:iCs w:val="false"/>
-                <w:color w:val="17242D"/>
-                <w:rtl w:val="false"/>
-              </w:rPr>
-              <w:t xml:space="preserve"/>
-            </w:r>
-          </w:p>
-        </w:tc>
-        <w:tc>
-          <w:tcPr>
-            <w:tcW w:type="dxa" w:w="1805"/>
-            <w:shd w:fill="FFFFFF"/>
-          </w:tcPr>
-          <w:p>
-            <w:pPr>
-              <w:bidi w:val="false"/>
-              <w:jc w:val="left"/>
-            </w:pPr>
-            <w:r>
-              <w:rPr>
-                <w:b w:val="false"/>
-                <w:bCs w:val="false"/>
-                <w:i w:val="false"/>
-                <w:iCs w:val="false"/>
-                <w:color w:val="17242D"/>
-                <w:rtl w:val="false"/>
-              </w:rPr>
-              <w:t xml:space="preserve"/>
-            </w:r>
-          </w:p>
-        </w:tc>
-        <w:tc>
-          <w:tcPr>
-            <w:tcW w:type="dxa" w:w="1805"/>
-            <w:shd w:fill="FFFFFF"/>
-          </w:tcPr>
-          <w:p>
-            <w:pPr>
-              <w:bidi w:val="false"/>
-              <w:jc w:val="left"/>
-            </w:pPr>
-            <w:r>
-              <w:rPr>
-                <w:b w:val="false"/>
-                <w:bCs w:val="false"/>
-                <w:i w:val="false"/>
-                <w:iCs w:val="false"/>
-                <w:color w:val="17242D"/>
-                <w:rtl w:val="false"/>
-              </w:rPr>
-              <w:t xml:space="preserve"/>
-            </w:r>
-          </w:p>
-        </w:tc>
-        <w:tc>
-          <w:tcPr>
-            <w:tcW w:type="dxa" w:w="1805"/>
+            <w:tcW w:type="dxa" w:w="1506"/>
+            <w:shd w:fill="FFFFFF"/>
+          </w:tcPr>
+          <w:p>
+            <w:pPr>
+              <w:bidi w:val="false"/>
+              <w:jc w:val="left"/>
+            </w:pPr>
+            <w:r>
+              <w:rPr>
+                <w:b w:val="false"/>
+                <w:bCs w:val="false"/>
+                <w:i w:val="false"/>
+                <w:iCs w:val="false"/>
+                <w:color w:val="17242D"/>
+                <w:rtl w:val="false"/>
+              </w:rPr>
+              <w:t xml:space="preserve">2 Fix</w:t>
+            </w:r>
+          </w:p>
+        </w:tc>
+        <w:tc>
+          <w:tcPr>
+            <w:tcW w:type="dxa" w:w="1504"/>
+            <w:shd w:fill="FFFFFF"/>
+          </w:tcPr>
+          <w:p>
+            <w:pPr>
+              <w:bidi w:val="false"/>
+              <w:jc w:val="left"/>
+            </w:pPr>
+            <w:r>
+              <w:rPr>
+                <w:b w:val="false"/>
+                <w:bCs w:val="false"/>
+                <w:i w:val="false"/>
+                <w:iCs w:val="false"/>
+                <w:color w:val="17242D"/>
+                <w:rtl w:val="false"/>
+              </w:rPr>
+              <w:t xml:space="preserve"/>
+            </w:r>
+          </w:p>
+        </w:tc>
+        <w:tc>
+          <w:tcPr>
+            <w:tcW w:type="dxa" w:w="1504"/>
+            <w:shd w:fill="FFFFFF"/>
+          </w:tcPr>
+          <w:p>
+            <w:pPr>
+              <w:bidi w:val="false"/>
+              <w:jc w:val="left"/>
+            </w:pPr>
+            <w:r>
+              <w:rPr>
+                <w:b w:val="false"/>
+                <w:bCs w:val="false"/>
+                <w:i w:val="false"/>
+                <w:iCs w:val="false"/>
+                <w:color w:val="17242D"/>
+                <w:rtl w:val="false"/>
+              </w:rPr>
+              <w:t xml:space="preserve"/>
+            </w:r>
+          </w:p>
+        </w:tc>
+        <w:tc>
+          <w:tcPr>
+            <w:tcW w:type="dxa" w:w="1504"/>
+            <w:shd w:fill="FFFFFF"/>
+          </w:tcPr>
+          <w:p>
+            <w:pPr>
+              <w:bidi w:val="false"/>
+              <w:jc w:val="left"/>
+            </w:pPr>
+            <w:r>
+              <w:rPr>
+                <w:b w:val="false"/>
+                <w:bCs w:val="false"/>
+                <w:i w:val="false"/>
+                <w:iCs w:val="false"/>
+                <w:color w:val="17242D"/>
+                <w:rtl w:val="false"/>
+              </w:rPr>
+              <w:t xml:space="preserve"/>
+            </w:r>
+          </w:p>
+        </w:tc>
+        <w:tc>
+          <w:tcPr>
+            <w:tcW w:type="dxa" w:w="1504"/>
+            <w:shd w:fill="FFFFFF"/>
+          </w:tcPr>
+          <w:p>
+            <w:pPr>
+              <w:bidi w:val="false"/>
+              <w:jc w:val="left"/>
+            </w:pPr>
+            <w:r>
+              <w:rPr>
+                <w:b w:val="false"/>
+                <w:bCs w:val="false"/>
+                <w:i w:val="false"/>
+                <w:iCs w:val="false"/>
+                <w:color w:val="17242D"/>
+                <w:rtl w:val="false"/>
+              </w:rPr>
+              <w:t xml:space="preserve"/>
+            </w:r>
+          </w:p>
+        </w:tc>
+        <w:tc>
+          <w:tcPr>
+            <w:tcW w:type="dxa" w:w="1504"/>
             <w:shd w:fill="FFFFFF"/>
           </w:tcPr>
           <w:p>
@@ -23115,99 +22778,122 @@
         </w:trPr>
         <w:tc>
           <w:tcPr>
-            <w:tcW w:type="dxa" w:w="1806"/>
-            <w:shd w:fill="FFFFFF"/>
-          </w:tcPr>
-          <w:p>
-            <w:pPr>
-              <w:bidi w:val="false"/>
-              <w:jc w:val="left"/>
-            </w:pPr>
-            <w:r>
-              <w:rPr>
-                <w:b w:val="false"/>
-                <w:bCs w:val="false"/>
-                <w:i w:val="false"/>
-                <w:iCs w:val="false"/>
-                <w:color w:val="17242D"/>
-                <w:rtl w:val="false"/>
-              </w:rPr>
-              <w:t xml:space="preserve">3</w:t>
-            </w:r>
-          </w:p>
-        </w:tc>
-        <w:tc>
-          <w:tcPr>
-            <w:tcW w:type="dxa" w:w="1805"/>
-            <w:shd w:fill="FFFFFF"/>
-          </w:tcPr>
-          <w:p>
-            <w:pPr>
-              <w:bidi w:val="false"/>
-              <w:jc w:val="left"/>
-            </w:pPr>
-            <w:r>
-              <w:rPr>
-                <w:b w:val="false"/>
-                <w:bCs w:val="false"/>
-                <w:i w:val="false"/>
-                <w:iCs w:val="false"/>
-                <w:color w:val="17242D"/>
-                <w:rtl w:val="false"/>
-              </w:rPr>
-              <w:t xml:space="preserve"/>
-            </w:r>
-          </w:p>
-        </w:tc>
-        <w:tc>
-          <w:tcPr>
-            <w:tcW w:type="dxa" w:w="1805"/>
-            <w:shd w:fill="FFFFFF"/>
-          </w:tcPr>
-          <w:p>
-            <w:pPr>
-              <w:bidi w:val="false"/>
-              <w:jc w:val="left"/>
-            </w:pPr>
-            <w:r>
-              <w:rPr>
-                <w:b w:val="false"/>
-                <w:bCs w:val="false"/>
-                <w:i w:val="false"/>
-                <w:iCs w:val="false"/>
-                <w:color w:val="17242D"/>
-                <w:rtl w:val="false"/>
-              </w:rPr>
-              <w:t xml:space="preserve"/>
-            </w:r>
-          </w:p>
-        </w:tc>
-        <w:tc>
-          <w:tcPr>
-            <w:tcW w:type="dxa" w:w="1805"/>
-            <w:shd w:fill="FFFFFF"/>
-          </w:tcPr>
-          <w:p>
-            <w:pPr>
-              <w:bidi w:val="false"/>
-              <w:jc w:val="left"/>
-            </w:pPr>
-            <w:r>
-              <w:rPr>
-                <w:b w:val="false"/>
-                <w:bCs w:val="false"/>
-                <w:i w:val="false"/>
-                <w:iCs w:val="false"/>
-                <w:color w:val="17242D"/>
-                <w:rtl w:val="false"/>
-              </w:rPr>
-              <w:t xml:space="preserve"/>
-            </w:r>
-          </w:p>
-        </w:tc>
-        <w:tc>
-          <w:tcPr>
-            <w:tcW w:type="dxa" w:w="1805"/>
+            <w:tcW w:type="dxa" w:w="1506"/>
+            <w:shd w:fill="FFFFFF"/>
+          </w:tcPr>
+          <w:p>
+            <w:pPr>
+              <w:bidi w:val="false"/>
+              <w:jc w:val="left"/>
+            </w:pPr>
+            <w:r>
+              <w:rPr>
+                <w:b w:val="false"/>
+                <w:bCs w:val="false"/>
+                <w:i w:val="false"/>
+                <w:iCs w:val="false"/>
+                <w:color w:val="17242D"/>
+                <w:rtl w:val="false"/>
+              </w:rPr>
+              <w:t xml:space="preserve">3 Move</w:t>
+            </w:r>
+          </w:p>
+        </w:tc>
+        <w:tc>
+          <w:tcPr>
+            <w:tcW w:type="dxa" w:w="1504"/>
+            <w:shd w:fill="FFFFFF"/>
+          </w:tcPr>
+          <w:p>
+            <w:pPr>
+              <w:bidi w:val="false"/>
+              <w:jc w:val="left"/>
+            </w:pPr>
+            <w:r>
+              <w:rPr>
+                <w:b w:val="false"/>
+                <w:bCs w:val="false"/>
+                <w:i w:val="false"/>
+                <w:iCs w:val="false"/>
+                <w:color w:val="17242D"/>
+                <w:rtl w:val="false"/>
+              </w:rPr>
+              <w:t xml:space="preserve"/>
+            </w:r>
+          </w:p>
+        </w:tc>
+        <w:tc>
+          <w:tcPr>
+            <w:tcW w:type="dxa" w:w="1504"/>
+            <w:shd w:fill="FFFFFF"/>
+          </w:tcPr>
+          <w:p>
+            <w:pPr>
+              <w:bidi w:val="false"/>
+              <w:jc w:val="left"/>
+            </w:pPr>
+            <w:r>
+              <w:rPr>
+                <w:b w:val="false"/>
+                <w:bCs w:val="false"/>
+                <w:i w:val="false"/>
+                <w:iCs w:val="false"/>
+                <w:color w:val="17242D"/>
+                <w:rtl w:val="false"/>
+              </w:rPr>
+              <w:t xml:space="preserve"/>
+            </w:r>
+          </w:p>
+        </w:tc>
+        <w:tc>
+          <w:tcPr>
+            <w:tcW w:type="dxa" w:w="1504"/>
+            <w:shd w:fill="FFFFFF"/>
+          </w:tcPr>
+          <w:p>
+            <w:pPr>
+              <w:bidi w:val="false"/>
+              <w:jc w:val="left"/>
+            </w:pPr>
+            <w:r>
+              <w:rPr>
+                <w:b w:val="false"/>
+                <w:bCs w:val="false"/>
+                <w:i w:val="false"/>
+                <w:iCs w:val="false"/>
+                <w:color w:val="17242D"/>
+                <w:rtl w:val="false"/>
+              </w:rPr>
+              <w:t xml:space="preserve"/>
+            </w:r>
+          </w:p>
+        </w:tc>
+        <w:tc>
+          <w:tcPr>
+            <w:tcW w:type="dxa" w:w="1504"/>
+            <w:shd w:fill="FFFFFF"/>
+          </w:tcPr>
+          <w:p>
+            <w:pPr>
+              <w:bidi w:val="false"/>
+              <w:jc w:val="left"/>
+            </w:pPr>
+            <w:r>
+              <w:rPr>
+                <w:b w:val="false"/>
+                <w:bCs w:val="false"/>
+                <w:i w:val="false"/>
+                <w:iCs w:val="false"/>
+                <w:color w:val="17242D"/>
+                <w:rtl w:val="false"/>
+              </w:rPr>
+              <w:t xml:space="preserve"/>
+            </w:r>
+          </w:p>
+        </w:tc>
+        <w:tc>
+          <w:tcPr>
+            <w:tcW w:type="dxa" w:w="1504"/>
             <w:shd w:fill="FFFFFF"/>
           </w:tcPr>
           <w:p>
@@ -23235,99 +22921,122 @@
         </w:trPr>
         <w:tc>
           <w:tcPr>
-            <w:tcW w:type="dxa" w:w="1806"/>
-            <w:shd w:fill="FFFFFF"/>
-          </w:tcPr>
-          <w:p>
-            <w:pPr>
-              <w:bidi w:val="false"/>
-              <w:jc w:val="left"/>
-            </w:pPr>
-            <w:r>
-              <w:rPr>
-                <w:b w:val="false"/>
-                <w:bCs w:val="false"/>
-                <w:i w:val="false"/>
-                <w:iCs w:val="false"/>
-                <w:color w:val="17242D"/>
-                <w:rtl w:val="false"/>
-              </w:rPr>
-              <w:t xml:space="preserve">4</w:t>
-            </w:r>
-          </w:p>
-        </w:tc>
-        <w:tc>
-          <w:tcPr>
-            <w:tcW w:type="dxa" w:w="1805"/>
-            <w:shd w:fill="FFFFFF"/>
-          </w:tcPr>
-          <w:p>
-            <w:pPr>
-              <w:bidi w:val="false"/>
-              <w:jc w:val="left"/>
-            </w:pPr>
-            <w:r>
-              <w:rPr>
-                <w:b w:val="false"/>
-                <w:bCs w:val="false"/>
-                <w:i w:val="false"/>
-                <w:iCs w:val="false"/>
-                <w:color w:val="17242D"/>
-                <w:rtl w:val="false"/>
-              </w:rPr>
-              <w:t xml:space="preserve"/>
-            </w:r>
-          </w:p>
-        </w:tc>
-        <w:tc>
-          <w:tcPr>
-            <w:tcW w:type="dxa" w:w="1805"/>
-            <w:shd w:fill="FFFFFF"/>
-          </w:tcPr>
-          <w:p>
-            <w:pPr>
-              <w:bidi w:val="false"/>
-              <w:jc w:val="left"/>
-            </w:pPr>
-            <w:r>
-              <w:rPr>
-                <w:b w:val="false"/>
-                <w:bCs w:val="false"/>
-                <w:i w:val="false"/>
-                <w:iCs w:val="false"/>
-                <w:color w:val="17242D"/>
-                <w:rtl w:val="false"/>
-              </w:rPr>
-              <w:t xml:space="preserve"/>
-            </w:r>
-          </w:p>
-        </w:tc>
-        <w:tc>
-          <w:tcPr>
-            <w:tcW w:type="dxa" w:w="1805"/>
-            <w:shd w:fill="FFFFFF"/>
-          </w:tcPr>
-          <w:p>
-            <w:pPr>
-              <w:bidi w:val="false"/>
-              <w:jc w:val="left"/>
-            </w:pPr>
-            <w:r>
-              <w:rPr>
-                <w:b w:val="false"/>
-                <w:bCs w:val="false"/>
-                <w:i w:val="false"/>
-                <w:iCs w:val="false"/>
-                <w:color w:val="17242D"/>
-                <w:rtl w:val="false"/>
-              </w:rPr>
-              <w:t xml:space="preserve"/>
-            </w:r>
-          </w:p>
-        </w:tc>
-        <w:tc>
-          <w:tcPr>
-            <w:tcW w:type="dxa" w:w="1805"/>
+            <w:tcW w:type="dxa" w:w="1506"/>
+            <w:shd w:fill="FFFFFF"/>
+          </w:tcPr>
+          <w:p>
+            <w:pPr>
+              <w:bidi w:val="false"/>
+              <w:jc w:val="left"/>
+            </w:pPr>
+            <w:r>
+              <w:rPr>
+                <w:b w:val="false"/>
+                <w:bCs w:val="false"/>
+                <w:i w:val="false"/>
+                <w:iCs w:val="false"/>
+                <w:color w:val="17242D"/>
+                <w:rtl w:val="false"/>
+              </w:rPr>
+              <w:t xml:space="preserve">4 Video</w:t>
+            </w:r>
+          </w:p>
+        </w:tc>
+        <w:tc>
+          <w:tcPr>
+            <w:tcW w:type="dxa" w:w="1504"/>
+            <w:shd w:fill="FFFFFF"/>
+          </w:tcPr>
+          <w:p>
+            <w:pPr>
+              <w:bidi w:val="false"/>
+              <w:jc w:val="left"/>
+            </w:pPr>
+            <w:r>
+              <w:rPr>
+                <w:b w:val="false"/>
+                <w:bCs w:val="false"/>
+                <w:i w:val="false"/>
+                <w:iCs w:val="false"/>
+                <w:color w:val="17242D"/>
+                <w:rtl w:val="false"/>
+              </w:rPr>
+              <w:t xml:space="preserve"/>
+            </w:r>
+          </w:p>
+        </w:tc>
+        <w:tc>
+          <w:tcPr>
+            <w:tcW w:type="dxa" w:w="1504"/>
+            <w:shd w:fill="FFFFFF"/>
+          </w:tcPr>
+          <w:p>
+            <w:pPr>
+              <w:bidi w:val="false"/>
+              <w:jc w:val="left"/>
+            </w:pPr>
+            <w:r>
+              <w:rPr>
+                <w:b w:val="false"/>
+                <w:bCs w:val="false"/>
+                <w:i w:val="false"/>
+                <w:iCs w:val="false"/>
+                <w:color w:val="17242D"/>
+                <w:rtl w:val="false"/>
+              </w:rPr>
+              <w:t xml:space="preserve"/>
+            </w:r>
+          </w:p>
+        </w:tc>
+        <w:tc>
+          <w:tcPr>
+            <w:tcW w:type="dxa" w:w="1504"/>
+            <w:shd w:fill="FFFFFF"/>
+          </w:tcPr>
+          <w:p>
+            <w:pPr>
+              <w:bidi w:val="false"/>
+              <w:jc w:val="left"/>
+            </w:pPr>
+            <w:r>
+              <w:rPr>
+                <w:b w:val="false"/>
+                <w:bCs w:val="false"/>
+                <w:i w:val="false"/>
+                <w:iCs w:val="false"/>
+                <w:color w:val="17242D"/>
+                <w:rtl w:val="false"/>
+              </w:rPr>
+              <w:t xml:space="preserve"/>
+            </w:r>
+          </w:p>
+        </w:tc>
+        <w:tc>
+          <w:tcPr>
+            <w:tcW w:type="dxa" w:w="1504"/>
+            <w:shd w:fill="FFFFFF"/>
+          </w:tcPr>
+          <w:p>
+            <w:pPr>
+              <w:bidi w:val="false"/>
+              <w:jc w:val="left"/>
+            </w:pPr>
+            <w:r>
+              <w:rPr>
+                <w:b w:val="false"/>
+                <w:bCs w:val="false"/>
+                <w:i w:val="false"/>
+                <w:iCs w:val="false"/>
+                <w:color w:val="17242D"/>
+                <w:rtl w:val="false"/>
+              </w:rPr>
+              <w:t xml:space="preserve"/>
+            </w:r>
+          </w:p>
+        </w:tc>
+        <w:tc>
+          <w:tcPr>
+            <w:tcW w:type="dxa" w:w="1504"/>
             <w:shd w:fill="FFFFFF"/>
           </w:tcPr>
           <w:p>
@@ -23355,99 +23064,122 @@
         </w:trPr>
         <w:tc>
           <w:tcPr>
-            <w:tcW w:type="dxa" w:w="1806"/>
-            <w:shd w:fill="FFFFFF"/>
-          </w:tcPr>
-          <w:p>
-            <w:pPr>
-              <w:bidi w:val="false"/>
-              <w:jc w:val="left"/>
-            </w:pPr>
-            <w:r>
-              <w:rPr>
-                <w:b w:val="false"/>
-                <w:bCs w:val="false"/>
-                <w:i w:val="false"/>
-                <w:iCs w:val="false"/>
-                <w:color w:val="17242D"/>
-                <w:rtl w:val="false"/>
-              </w:rPr>
-              <w:t xml:space="preserve">5</w:t>
-            </w:r>
-          </w:p>
-        </w:tc>
-        <w:tc>
-          <w:tcPr>
-            <w:tcW w:type="dxa" w:w="1805"/>
-            <w:shd w:fill="FFFFFF"/>
-          </w:tcPr>
-          <w:p>
-            <w:pPr>
-              <w:bidi w:val="false"/>
-              <w:jc w:val="left"/>
-            </w:pPr>
-            <w:r>
-              <w:rPr>
-                <w:b w:val="false"/>
-                <w:bCs w:val="false"/>
-                <w:i w:val="false"/>
-                <w:iCs w:val="false"/>
-                <w:color w:val="17242D"/>
-                <w:rtl w:val="false"/>
-              </w:rPr>
-              <w:t xml:space="preserve"/>
-            </w:r>
-          </w:p>
-        </w:tc>
-        <w:tc>
-          <w:tcPr>
-            <w:tcW w:type="dxa" w:w="1805"/>
-            <w:shd w:fill="FFFFFF"/>
-          </w:tcPr>
-          <w:p>
-            <w:pPr>
-              <w:bidi w:val="false"/>
-              <w:jc w:val="left"/>
-            </w:pPr>
-            <w:r>
-              <w:rPr>
-                <w:b w:val="false"/>
-                <w:bCs w:val="false"/>
-                <w:i w:val="false"/>
-                <w:iCs w:val="false"/>
-                <w:color w:val="17242D"/>
-                <w:rtl w:val="false"/>
-              </w:rPr>
-              <w:t xml:space="preserve"/>
-            </w:r>
-          </w:p>
-        </w:tc>
-        <w:tc>
-          <w:tcPr>
-            <w:tcW w:type="dxa" w:w="1805"/>
-            <w:shd w:fill="FFFFFF"/>
-          </w:tcPr>
-          <w:p>
-            <w:pPr>
-              <w:bidi w:val="false"/>
-              <w:jc w:val="left"/>
-            </w:pPr>
-            <w:r>
-              <w:rPr>
-                <w:b w:val="false"/>
-                <w:bCs w:val="false"/>
-                <w:i w:val="false"/>
-                <w:iCs w:val="false"/>
-                <w:color w:val="17242D"/>
-                <w:rtl w:val="false"/>
-              </w:rPr>
-              <w:t xml:space="preserve"/>
-            </w:r>
-          </w:p>
-        </w:tc>
-        <w:tc>
-          <w:tcPr>
-            <w:tcW w:type="dxa" w:w="1805"/>
+            <w:tcW w:type="dxa" w:w="1506"/>
+            <w:shd w:fill="FFFFFF"/>
+          </w:tcPr>
+          <w:p>
+            <w:pPr>
+              <w:bidi w:val="false"/>
+              <w:jc w:val="left"/>
+            </w:pPr>
+            <w:r>
+              <w:rPr>
+                <w:b w:val="false"/>
+                <w:bCs w:val="false"/>
+                <w:i w:val="false"/>
+                <w:iCs w:val="false"/>
+                <w:color w:val="17242D"/>
+                <w:rtl w:val="false"/>
+              </w:rPr>
+              <w:t xml:space="preserve">5 Narrate</w:t>
+            </w:r>
+          </w:p>
+        </w:tc>
+        <w:tc>
+          <w:tcPr>
+            <w:tcW w:type="dxa" w:w="1504"/>
+            <w:shd w:fill="FFFFFF"/>
+          </w:tcPr>
+          <w:p>
+            <w:pPr>
+              <w:bidi w:val="false"/>
+              <w:jc w:val="left"/>
+            </w:pPr>
+            <w:r>
+              <w:rPr>
+                <w:b w:val="false"/>
+                <w:bCs w:val="false"/>
+                <w:i w:val="false"/>
+                <w:iCs w:val="false"/>
+                <w:color w:val="17242D"/>
+                <w:rtl w:val="false"/>
+              </w:rPr>
+              <w:t xml:space="preserve"/>
+            </w:r>
+          </w:p>
+        </w:tc>
+        <w:tc>
+          <w:tcPr>
+            <w:tcW w:type="dxa" w:w="1504"/>
+            <w:shd w:fill="FFFFFF"/>
+          </w:tcPr>
+          <w:p>
+            <w:pPr>
+              <w:bidi w:val="false"/>
+              <w:jc w:val="left"/>
+            </w:pPr>
+            <w:r>
+              <w:rPr>
+                <w:b w:val="false"/>
+                <w:bCs w:val="false"/>
+                <w:i w:val="false"/>
+                <w:iCs w:val="false"/>
+                <w:color w:val="17242D"/>
+                <w:rtl w:val="false"/>
+              </w:rPr>
+              <w:t xml:space="preserve"/>
+            </w:r>
+          </w:p>
+        </w:tc>
+        <w:tc>
+          <w:tcPr>
+            <w:tcW w:type="dxa" w:w="1504"/>
+            <w:shd w:fill="FFFFFF"/>
+          </w:tcPr>
+          <w:p>
+            <w:pPr>
+              <w:bidi w:val="false"/>
+              <w:jc w:val="left"/>
+            </w:pPr>
+            <w:r>
+              <w:rPr>
+                <w:b w:val="false"/>
+                <w:bCs w:val="false"/>
+                <w:i w:val="false"/>
+                <w:iCs w:val="false"/>
+                <w:color w:val="17242D"/>
+                <w:rtl w:val="false"/>
+              </w:rPr>
+              <w:t xml:space="preserve"/>
+            </w:r>
+          </w:p>
+        </w:tc>
+        <w:tc>
+          <w:tcPr>
+            <w:tcW w:type="dxa" w:w="1504"/>
+            <w:shd w:fill="FFFFFF"/>
+          </w:tcPr>
+          <w:p>
+            <w:pPr>
+              <w:bidi w:val="false"/>
+              <w:jc w:val="left"/>
+            </w:pPr>
+            <w:r>
+              <w:rPr>
+                <w:b w:val="false"/>
+                <w:bCs w:val="false"/>
+                <w:i w:val="false"/>
+                <w:iCs w:val="false"/>
+                <w:color w:val="17242D"/>
+                <w:rtl w:val="false"/>
+              </w:rPr>
+              <w:t xml:space="preserve"/>
+            </w:r>
+          </w:p>
+        </w:tc>
+        <w:tc>
+          <w:tcPr>
+            <w:tcW w:type="dxa" w:w="1504"/>
             <w:shd w:fill="FFFFFF"/>
           </w:tcPr>
           <w:p>
@@ -23475,99 +23207,122 @@
         </w:trPr>
         <w:tc>
           <w:tcPr>
-            <w:tcW w:type="dxa" w:w="1806"/>
-            <w:shd w:fill="FFFFFF"/>
-          </w:tcPr>
-          <w:p>
-            <w:pPr>
-              <w:bidi w:val="false"/>
-              <w:jc w:val="left"/>
-            </w:pPr>
-            <w:r>
-              <w:rPr>
-                <w:b w:val="false"/>
-                <w:bCs w:val="false"/>
-                <w:i w:val="false"/>
-                <w:iCs w:val="false"/>
-                <w:color w:val="17242D"/>
-                <w:rtl w:val="false"/>
-              </w:rPr>
-              <w:t xml:space="preserve">6</w:t>
-            </w:r>
-          </w:p>
-        </w:tc>
-        <w:tc>
-          <w:tcPr>
-            <w:tcW w:type="dxa" w:w="1805"/>
-            <w:shd w:fill="FFFFFF"/>
-          </w:tcPr>
-          <w:p>
-            <w:pPr>
-              <w:bidi w:val="false"/>
-              <w:jc w:val="left"/>
-            </w:pPr>
-            <w:r>
-              <w:rPr>
-                <w:b w:val="false"/>
-                <w:bCs w:val="false"/>
-                <w:i w:val="false"/>
-                <w:iCs w:val="false"/>
-                <w:color w:val="17242D"/>
-                <w:rtl w:val="false"/>
-              </w:rPr>
-              <w:t xml:space="preserve"/>
-            </w:r>
-          </w:p>
-        </w:tc>
-        <w:tc>
-          <w:tcPr>
-            <w:tcW w:type="dxa" w:w="1805"/>
-            <w:shd w:fill="FFFFFF"/>
-          </w:tcPr>
-          <w:p>
-            <w:pPr>
-              <w:bidi w:val="false"/>
-              <w:jc w:val="left"/>
-            </w:pPr>
-            <w:r>
-              <w:rPr>
-                <w:b w:val="false"/>
-                <w:bCs w:val="false"/>
-                <w:i w:val="false"/>
-                <w:iCs w:val="false"/>
-                <w:color w:val="17242D"/>
-                <w:rtl w:val="false"/>
-              </w:rPr>
-              <w:t xml:space="preserve"/>
-            </w:r>
-          </w:p>
-        </w:tc>
-        <w:tc>
-          <w:tcPr>
-            <w:tcW w:type="dxa" w:w="1805"/>
-            <w:shd w:fill="FFFFFF"/>
-          </w:tcPr>
-          <w:p>
-            <w:pPr>
-              <w:bidi w:val="false"/>
-              <w:jc w:val="left"/>
-            </w:pPr>
-            <w:r>
-              <w:rPr>
-                <w:b w:val="false"/>
-                <w:bCs w:val="false"/>
-                <w:i w:val="false"/>
-                <w:iCs w:val="false"/>
-                <w:color w:val="17242D"/>
-                <w:rtl w:val="false"/>
-              </w:rPr>
-              <w:t xml:space="preserve"/>
-            </w:r>
-          </w:p>
-        </w:tc>
-        <w:tc>
-          <w:tcPr>
-            <w:tcW w:type="dxa" w:w="1805"/>
+            <w:tcW w:type="dxa" w:w="1506"/>
+            <w:shd w:fill="FFFFFF"/>
+          </w:tcPr>
+          <w:p>
+            <w:pPr>
+              <w:bidi w:val="false"/>
+              <w:jc w:val="left"/>
+            </w:pPr>
+            <w:r>
+              <w:rPr>
+                <w:b w:val="false"/>
+                <w:bCs w:val="false"/>
+                <w:i w:val="false"/>
+                <w:iCs w:val="false"/>
+                <w:color w:val="17242D"/>
+                <w:rtl w:val="false"/>
+              </w:rPr>
+              <w:t xml:space="preserve">6 Assemble</w:t>
+            </w:r>
+          </w:p>
+        </w:tc>
+        <w:tc>
+          <w:tcPr>
+            <w:tcW w:type="dxa" w:w="1504"/>
+            <w:shd w:fill="FFFFFF"/>
+          </w:tcPr>
+          <w:p>
+            <w:pPr>
+              <w:bidi w:val="false"/>
+              <w:jc w:val="left"/>
+            </w:pPr>
+            <w:r>
+              <w:rPr>
+                <w:b w:val="false"/>
+                <w:bCs w:val="false"/>
+                <w:i w:val="false"/>
+                <w:iCs w:val="false"/>
+                <w:color w:val="17242D"/>
+                <w:rtl w:val="false"/>
+              </w:rPr>
+              <w:t xml:space="preserve"/>
+            </w:r>
+          </w:p>
+        </w:tc>
+        <w:tc>
+          <w:tcPr>
+            <w:tcW w:type="dxa" w:w="1504"/>
+            <w:shd w:fill="FFFFFF"/>
+          </w:tcPr>
+          <w:p>
+            <w:pPr>
+              <w:bidi w:val="false"/>
+              <w:jc w:val="left"/>
+            </w:pPr>
+            <w:r>
+              <w:rPr>
+                <w:b w:val="false"/>
+                <w:bCs w:val="false"/>
+                <w:i w:val="false"/>
+                <w:iCs w:val="false"/>
+                <w:color w:val="17242D"/>
+                <w:rtl w:val="false"/>
+              </w:rPr>
+              <w:t xml:space="preserve"/>
+            </w:r>
+          </w:p>
+        </w:tc>
+        <w:tc>
+          <w:tcPr>
+            <w:tcW w:type="dxa" w:w="1504"/>
+            <w:shd w:fill="FFFFFF"/>
+          </w:tcPr>
+          <w:p>
+            <w:pPr>
+              <w:bidi w:val="false"/>
+              <w:jc w:val="left"/>
+            </w:pPr>
+            <w:r>
+              <w:rPr>
+                <w:b w:val="false"/>
+                <w:bCs w:val="false"/>
+                <w:i w:val="false"/>
+                <w:iCs w:val="false"/>
+                <w:color w:val="17242D"/>
+                <w:rtl w:val="false"/>
+              </w:rPr>
+              <w:t xml:space="preserve"/>
+            </w:r>
+          </w:p>
+        </w:tc>
+        <w:tc>
+          <w:tcPr>
+            <w:tcW w:type="dxa" w:w="1504"/>
+            <w:shd w:fill="FFFFFF"/>
+          </w:tcPr>
+          <w:p>
+            <w:pPr>
+              <w:bidi w:val="false"/>
+              <w:jc w:val="left"/>
+            </w:pPr>
+            <w:r>
+              <w:rPr>
+                <w:b w:val="false"/>
+                <w:bCs w:val="false"/>
+                <w:i w:val="false"/>
+                <w:iCs w:val="false"/>
+                <w:color w:val="17242D"/>
+                <w:rtl w:val="false"/>
+              </w:rPr>
+              <w:t xml:space="preserve"/>
+            </w:r>
+          </w:p>
+        </w:tc>
+        <w:tc>
+          <w:tcPr>
+            <w:tcW w:type="dxa" w:w="1504"/>
             <w:shd w:fill="FFFFFF"/>
           </w:tcPr>
           <w:p>
@@ -23721,7 +23476,7 @@
                 <w:color w:val="55606E"/>
                 <w:rtl w:val="false"/>
               </w:rPr>
-              <w:t xml:space="preserve">Example: the claim that the new route is better lit</w:t>
+              <w:t xml:space="preserve">Example: that every generated clip carries a visible label</w:t>
             </w:r>
           </w:p>
         </w:tc>
@@ -23744,7 +23499,7 @@
                 <w:color w:val="55606E"/>
                 <w:rtl w:val="false"/>
               </w:rPr>
-              <w:t xml:space="preserve">The council street-lighting map, 20 April</w:t>
+              <w:t xml:space="preserve">My own review before sharing, 12 May</w:t>
             </w:r>
           </w:p>
         </w:tc>
@@ -23767,7 +23522,7 @@
                 <w:color w:val="55606E"/>
                 <w:rtl w:val="false"/>
               </w:rPr>
-              <w:t xml:space="preserve">Link saved next to the storyboard</w:t>
+              <w:t xml:space="preserve">Screenshot of the label on the deck slide</w:t>
             </w:r>
           </w:p>
         </w:tc>
@@ -23951,7 +23706,7 @@
           <w:color w:val="17242D"/>
           <w:rtl w:val="false"/>
         </w:rPr>
-        <w:t xml:space="preserve">Save source links, permissions or consent notes, fact checks, the storyboard, and the final labels as evidence.</w:t>
+        <w:t xml:space="preserve">Save the stage log with prompts and fixes, the tool verdict, the finished deck with its labels, and a note of which tool you used at each stage as evidence.</w:t>
       </w:r>
     </w:p>
     <w:p>
@@ -23984,7 +23739,7 @@
           <w:color w:val="17242D"/>
           <w:rtl w:val="false"/>
         </w:rPr>
-        <w:t xml:space="preserve">Where could the audience be misled? What will make the story more accessible and trustworthy next time?</w:t>
+        <w:t xml:space="preserve">Where might a viewer mistake a generated clip for something real? What would you change before showing this to a wider audience?</w:t>
       </w:r>
     </w:p>
     <w:p>

</xml_diff>

<commit_message>
fix: address round-1 review findings on session 6 journal
- fix the photograph problem: Goal now says 'the image you generated'
  (EN) / 'התמונה שיצרתם' (HE), not 'your own image' / 'שלכם'
- stage log carries a worked example (all six stages) with real label
  text in the Labelled? column, plus an instructive lead-in restoring
  the 'not decoration, it is a claim' line; the for-the-real-piece
  duplicate stays blank to differentiate it
- tool verdict table now has five rows for the five products in the
  chain
- Hebrew: replace the טקסט-לקליפ calque with קליפ מטקסט, make the Goal's
  deck clause active instead of mirroring English clause order, and
  hold Steps to imperative throughout
- Silver no longer restates Bronze's narration; only the sync is new
- production-plan example row now names all five tools, including
  Google AI Studio and Canva

Co-Authored-By: Claude Opus 5 <noreply@anthropic.com>
</commit_message>
<xml_diff>
--- a/site/assets/downloads/applied-ai-mastery-personal-journal-en.docx
+++ b/site/assets/downloads/applied-ai-mastery-personal-journal-en.docx
@@ -20276,7 +20276,7 @@
                 <w:color w:val="55606E"/>
                 <w:rtl w:val="false"/>
               </w:rPr>
-              <w:t xml:space="preserve">Gemini throughout; Claude for the deck</w:t>
+              <w:t xml:space="preserve">Gemini for stages 1–4; Google AI Studio to narrate; Claude and Canva for the deck</w:t>
             </w:r>
           </w:p>
         </w:tc>
@@ -20395,6 +20395,21 @@
           <w:rtl w:val="false"/>
         </w:rPr>
         <w:t xml:space="preserve">2. Stage log</w:t>
+      </w:r>
+    </w:p>
+    <w:p>
+      <w:pPr>
+        <w:bidi w:val="false"/>
+        <w:jc w:val="left"/>
+      </w:pPr>
+      <w:r>
+        <w:rPr>
+          <w:b w:val="false"/>
+          <w:bCs w:val="false"/>
+          <w:color w:val="17242D"/>
+          <w:rtl w:val="false"/>
+        </w:rPr>
+        <w:t xml:space="preserve">Log every stage as you go. A generated image or clip that is not labelled is not decoration — it is a claim, so write what the label actually said, not just yes or no.</w:t>
       </w:r>
     </w:p>
     <w:tbl>
@@ -20605,7 +20620,7 @@
                 <w:color w:val="17242D"/>
                 <w:rtl w:val="false"/>
               </w:rPr>
-              <w:t xml:space="preserve"/>
+              <w:t xml:space="preserve">Gemini</w:t>
             </w:r>
           </w:p>
         </w:tc>
@@ -20628,7 +20643,7 @@
                 <w:color w:val="17242D"/>
                 <w:rtl w:val="false"/>
               </w:rPr>
-              <w:t xml:space="preserve"/>
+              <w:t xml:space="preserve">"A watercolour street at sunrise, tree-lined pavement, wide shot"</w:t>
             </w:r>
           </w:p>
         </w:tc>
@@ -20651,7 +20666,7 @@
                 <w:color w:val="17242D"/>
                 <w:rtl w:val="false"/>
               </w:rPr>
-              <w:t xml:space="preserve"/>
+              <w:t xml:space="preserve">A calm, daylight image, close to what I wanted, but the street sign was an unreadable blur</w:t>
             </w:r>
           </w:p>
         </w:tc>
@@ -20674,7 +20689,7 @@
                 <w:color w:val="17242D"/>
                 <w:rtl w:val="false"/>
               </w:rPr>
-              <w:t xml:space="preserve"/>
+              <w:t xml:space="preserve">—</w:t>
             </w:r>
           </w:p>
         </w:tc>
@@ -20697,7 +20712,7 @@
                 <w:color w:val="17242D"/>
                 <w:rtl w:val="false"/>
               </w:rPr>
-              <w:t xml:space="preserve"/>
+              <w:t xml:space="preserve">"AI-generated illustration" caption under the image</w:t>
             </w:r>
           </w:p>
         </w:tc>
@@ -20748,7 +20763,7 @@
                 <w:color w:val="17242D"/>
                 <w:rtl w:val="false"/>
               </w:rPr>
-              <w:t xml:space="preserve"/>
+              <w:t xml:space="preserve">Gemini</w:t>
             </w:r>
           </w:p>
         </w:tc>
@@ -20771,7 +20786,7 @@
                 <w:color w:val="17242D"/>
                 <w:rtl w:val="false"/>
               </w:rPr>
-              <w:t xml:space="preserve"/>
+              <w:t xml:space="preserve">"Keep everything the same, but make the street sign legible"</w:t>
             </w:r>
           </w:p>
         </w:tc>
@@ -20794,7 +20809,7 @@
                 <w:color w:val="17242D"/>
                 <w:rtl w:val="false"/>
               </w:rPr>
-              <w:t xml:space="preserve"/>
+              <w:t xml:space="preserve">Same scene, sign now readable</w:t>
             </w:r>
           </w:p>
         </w:tc>
@@ -20817,7 +20832,7 @@
                 <w:color w:val="17242D"/>
                 <w:rtl w:val="false"/>
               </w:rPr>
-              <w:t xml:space="preserve"/>
+              <w:t xml:space="preserve">Nothing further — this became the base image for the next stage</w:t>
             </w:r>
           </w:p>
         </w:tc>
@@ -20840,7 +20855,7 @@
                 <w:color w:val="17242D"/>
                 <w:rtl w:val="false"/>
               </w:rPr>
-              <w:t xml:space="preserve"/>
+              <w:t xml:space="preserve">Same caption carried over</w:t>
             </w:r>
           </w:p>
         </w:tc>
@@ -20891,7 +20906,7 @@
                 <w:color w:val="17242D"/>
                 <w:rtl w:val="false"/>
               </w:rPr>
-              <w:t xml:space="preserve"/>
+              <w:t xml:space="preserve">Gemini</w:t>
             </w:r>
           </w:p>
         </w:tc>
@@ -20914,7 +20929,7 @@
                 <w:color w:val="17242D"/>
                 <w:rtl w:val="false"/>
               </w:rPr>
-              <w:t xml:space="preserve"/>
+              <w:t xml:space="preserve">"Animate this image: a slow five-second pan from left to right"</w:t>
             </w:r>
           </w:p>
         </w:tc>
@@ -20937,7 +20952,7 @@
                 <w:color w:val="17242D"/>
                 <w:rtl w:val="false"/>
               </w:rPr>
-              <w:t xml:space="preserve"/>
+              <w:t xml:space="preserve">A five-second clip of the still image in gentle motion</w:t>
             </w:r>
           </w:p>
         </w:tc>
@@ -20960,7 +20975,7 @@
                 <w:color w:val="17242D"/>
                 <w:rtl w:val="false"/>
               </w:rPr>
-              <w:t xml:space="preserve"/>
+              <w:t xml:space="preserve">Trimmed the last half-second, where the motion glitched</w:t>
             </w:r>
           </w:p>
         </w:tc>
@@ -20983,7 +20998,7 @@
                 <w:color w:val="17242D"/>
                 <w:rtl w:val="false"/>
               </w:rPr>
-              <w:t xml:space="preserve"/>
+              <w:t xml:space="preserve">"Animated from an AI-generated illustration" on the clip</w:t>
             </w:r>
           </w:p>
         </w:tc>
@@ -21034,7 +21049,7 @@
                 <w:color w:val="17242D"/>
                 <w:rtl w:val="false"/>
               </w:rPr>
-              <w:t xml:space="preserve"/>
+              <w:t xml:space="preserve">Gemini</w:t>
             </w:r>
           </w:p>
         </w:tc>
@@ -21057,7 +21072,7 @@
                 <w:color w:val="17242D"/>
                 <w:rtl w:val="false"/>
               </w:rPr>
-              <w:t xml:space="preserve"/>
+              <w:t xml:space="preserve">"A quiet residential street at sunrise, wide shot, five seconds, no people" (text only, no image supplied)</w:t>
             </w:r>
           </w:p>
         </w:tc>
@@ -21080,7 +21095,7 @@
                 <w:color w:val="17242D"/>
                 <w:rtl w:val="false"/>
               </w:rPr>
-              <w:t xml:space="preserve"/>
+              <w:t xml:space="preserve">A second five-second clip generated straight from the description</w:t>
             </w:r>
           </w:p>
         </w:tc>
@@ -21103,7 +21118,7 @@
                 <w:color w:val="17242D"/>
                 <w:rtl w:val="false"/>
               </w:rPr>
-              <w:t xml:space="preserve"/>
+              <w:t xml:space="preserve">Trimmed one second off a slow start</w:t>
             </w:r>
           </w:p>
         </w:tc>
@@ -21126,7 +21141,7 @@
                 <w:color w:val="17242D"/>
                 <w:rtl w:val="false"/>
               </w:rPr>
-              <w:t xml:space="preserve"/>
+              <w:t xml:space="preserve">"Fully AI-generated video clip" on the clip</w:t>
             </w:r>
           </w:p>
         </w:tc>
@@ -21177,7 +21192,7 @@
                 <w:color w:val="17242D"/>
                 <w:rtl w:val="false"/>
               </w:rPr>
-              <w:t xml:space="preserve"/>
+              <w:t xml:space="preserve">Google AI Studio</w:t>
             </w:r>
           </w:p>
         </w:tc>
@@ -21200,7 +21215,7 @@
                 <w:color w:val="17242D"/>
                 <w:rtl w:val="false"/>
               </w:rPr>
-              <w:t xml:space="preserve"/>
+              <w:t xml:space="preserve">Read my written script over both clips, warm and unhurried</w:t>
             </w:r>
           </w:p>
         </w:tc>
@@ -21223,7 +21238,7 @@
                 <w:color w:val="17242D"/>
                 <w:rtl w:val="false"/>
               </w:rPr>
-              <w:t xml:space="preserve"/>
+              <w:t xml:space="preserve">A clear narration track, a little rushed in the first line</w:t>
             </w:r>
           </w:p>
         </w:tc>
@@ -21246,7 +21261,7 @@
                 <w:color w:val="17242D"/>
                 <w:rtl w:val="false"/>
               </w:rPr>
-              <w:t xml:space="preserve"/>
+              <w:t xml:space="preserve">Regenerated the first line at a slower pace</w:t>
             </w:r>
           </w:p>
         </w:tc>
@@ -21269,7 +21284,7 @@
                 <w:color w:val="17242D"/>
                 <w:rtl w:val="false"/>
               </w:rPr>
-              <w:t xml:space="preserve"/>
+              <w:t xml:space="preserve">Closing credit: "Narration generated by AI"</w:t>
             </w:r>
           </w:p>
         </w:tc>
@@ -21320,7 +21335,7 @@
                 <w:color w:val="17242D"/>
                 <w:rtl w:val="false"/>
               </w:rPr>
-              <w:t xml:space="preserve"/>
+              <w:t xml:space="preserve">Claude and Canva</w:t>
             </w:r>
           </w:p>
         </w:tc>
@@ -21343,7 +21358,7 @@
                 <w:color w:val="17242D"/>
                 <w:rtl w:val="false"/>
               </w:rPr>
-              <w:t xml:space="preserve"/>
+              <w:t xml:space="preserve">Asked Claude for a six-slide structure, then built it in Canva</w:t>
             </w:r>
           </w:p>
         </w:tc>
@@ -21366,7 +21381,7 @@
                 <w:color w:val="17242D"/>
                 <w:rtl w:val="false"/>
               </w:rPr>
-              <w:t xml:space="preserve"/>
+              <w:t xml:space="preserve">A working deck with both clips and the narration in sync</w:t>
             </w:r>
           </w:p>
         </w:tc>
@@ -21389,7 +21404,7 @@
                 <w:color w:val="17242D"/>
                 <w:rtl w:val="false"/>
               </w:rPr>
-              <w:t xml:space="preserve"/>
+              <w:t xml:space="preserve">Reordered two slides so the narration matched the visuals</w:t>
             </w:r>
           </w:p>
         </w:tc>
@@ -21412,7 +21427,7 @@
                 <w:color w:val="17242D"/>
                 <w:rtl w:val="false"/>
               </w:rPr>
-              <w:t xml:space="preserve"/>
+              <w:t xml:space="preserve">Every generated slide keeps its own caption</w:t>
             </w:r>
           </w:p>
         </w:tc>
@@ -21570,6 +21585,486 @@
                 <w:rtl w:val="false"/>
               </w:rPr>
               <w:t xml:space="preserve">Use again?</w:t>
+            </w:r>
+          </w:p>
+        </w:tc>
+      </w:tr>
+      <w:tr>
+        <w:trPr>
+          <w:trHeight w:val="454" w:hRule="atLeast"/>
+        </w:trPr>
+        <w:tc>
+          <w:tcPr>
+            <w:tcW w:type="dxa" w:w="1806"/>
+            <w:shd w:fill="FFFFFF"/>
+          </w:tcPr>
+          <w:p>
+            <w:pPr>
+              <w:bidi w:val="false"/>
+              <w:jc w:val="left"/>
+            </w:pPr>
+            <w:r>
+              <w:rPr>
+                <w:b w:val="false"/>
+                <w:bCs w:val="false"/>
+                <w:i w:val="false"/>
+                <w:iCs w:val="false"/>
+                <w:color w:val="17242D"/>
+                <w:rtl w:val="false"/>
+              </w:rPr>
+              <w:t xml:space="preserve"/>
+            </w:r>
+          </w:p>
+        </w:tc>
+        <w:tc>
+          <w:tcPr>
+            <w:tcW w:type="dxa" w:w="1805"/>
+            <w:shd w:fill="FFFFFF"/>
+          </w:tcPr>
+          <w:p>
+            <w:pPr>
+              <w:bidi w:val="false"/>
+              <w:jc w:val="left"/>
+            </w:pPr>
+            <w:r>
+              <w:rPr>
+                <w:b w:val="false"/>
+                <w:bCs w:val="false"/>
+                <w:i w:val="false"/>
+                <w:iCs w:val="false"/>
+                <w:color w:val="17242D"/>
+                <w:rtl w:val="false"/>
+              </w:rPr>
+              <w:t xml:space="preserve"/>
+            </w:r>
+          </w:p>
+        </w:tc>
+        <w:tc>
+          <w:tcPr>
+            <w:tcW w:type="dxa" w:w="1805"/>
+            <w:shd w:fill="FFFFFF"/>
+          </w:tcPr>
+          <w:p>
+            <w:pPr>
+              <w:bidi w:val="false"/>
+              <w:jc w:val="left"/>
+            </w:pPr>
+            <w:r>
+              <w:rPr>
+                <w:b w:val="false"/>
+                <w:bCs w:val="false"/>
+                <w:i w:val="false"/>
+                <w:iCs w:val="false"/>
+                <w:color w:val="17242D"/>
+                <w:rtl w:val="false"/>
+              </w:rPr>
+              <w:t xml:space="preserve"/>
+            </w:r>
+          </w:p>
+        </w:tc>
+        <w:tc>
+          <w:tcPr>
+            <w:tcW w:type="dxa" w:w="1805"/>
+            <w:shd w:fill="FFFFFF"/>
+          </w:tcPr>
+          <w:p>
+            <w:pPr>
+              <w:bidi w:val="false"/>
+              <w:jc w:val="left"/>
+            </w:pPr>
+            <w:r>
+              <w:rPr>
+                <w:b w:val="false"/>
+                <w:bCs w:val="false"/>
+                <w:i w:val="false"/>
+                <w:iCs w:val="false"/>
+                <w:color w:val="17242D"/>
+                <w:rtl w:val="false"/>
+              </w:rPr>
+              <w:t xml:space="preserve"/>
+            </w:r>
+          </w:p>
+        </w:tc>
+        <w:tc>
+          <w:tcPr>
+            <w:tcW w:type="dxa" w:w="1805"/>
+            <w:shd w:fill="FFFFFF"/>
+          </w:tcPr>
+          <w:p>
+            <w:pPr>
+              <w:bidi w:val="false"/>
+              <w:jc w:val="left"/>
+            </w:pPr>
+            <w:r>
+              <w:rPr>
+                <w:b w:val="false"/>
+                <w:bCs w:val="false"/>
+                <w:i w:val="false"/>
+                <w:iCs w:val="false"/>
+                <w:color w:val="17242D"/>
+                <w:rtl w:val="false"/>
+              </w:rPr>
+              <w:t xml:space="preserve"/>
+            </w:r>
+          </w:p>
+        </w:tc>
+      </w:tr>
+      <w:tr>
+        <w:trPr>
+          <w:trHeight w:val="454" w:hRule="atLeast"/>
+        </w:trPr>
+        <w:tc>
+          <w:tcPr>
+            <w:tcW w:type="dxa" w:w="1806"/>
+            <w:shd w:fill="FFFFFF"/>
+          </w:tcPr>
+          <w:p>
+            <w:pPr>
+              <w:bidi w:val="false"/>
+              <w:jc w:val="left"/>
+            </w:pPr>
+            <w:r>
+              <w:rPr>
+                <w:b w:val="false"/>
+                <w:bCs w:val="false"/>
+                <w:i w:val="false"/>
+                <w:iCs w:val="false"/>
+                <w:color w:val="17242D"/>
+                <w:rtl w:val="false"/>
+              </w:rPr>
+              <w:t xml:space="preserve"/>
+            </w:r>
+          </w:p>
+        </w:tc>
+        <w:tc>
+          <w:tcPr>
+            <w:tcW w:type="dxa" w:w="1805"/>
+            <w:shd w:fill="FFFFFF"/>
+          </w:tcPr>
+          <w:p>
+            <w:pPr>
+              <w:bidi w:val="false"/>
+              <w:jc w:val="left"/>
+            </w:pPr>
+            <w:r>
+              <w:rPr>
+                <w:b w:val="false"/>
+                <w:bCs w:val="false"/>
+                <w:i w:val="false"/>
+                <w:iCs w:val="false"/>
+                <w:color w:val="17242D"/>
+                <w:rtl w:val="false"/>
+              </w:rPr>
+              <w:t xml:space="preserve"/>
+            </w:r>
+          </w:p>
+        </w:tc>
+        <w:tc>
+          <w:tcPr>
+            <w:tcW w:type="dxa" w:w="1805"/>
+            <w:shd w:fill="FFFFFF"/>
+          </w:tcPr>
+          <w:p>
+            <w:pPr>
+              <w:bidi w:val="false"/>
+              <w:jc w:val="left"/>
+            </w:pPr>
+            <w:r>
+              <w:rPr>
+                <w:b w:val="false"/>
+                <w:bCs w:val="false"/>
+                <w:i w:val="false"/>
+                <w:iCs w:val="false"/>
+                <w:color w:val="17242D"/>
+                <w:rtl w:val="false"/>
+              </w:rPr>
+              <w:t xml:space="preserve"/>
+            </w:r>
+          </w:p>
+        </w:tc>
+        <w:tc>
+          <w:tcPr>
+            <w:tcW w:type="dxa" w:w="1805"/>
+            <w:shd w:fill="FFFFFF"/>
+          </w:tcPr>
+          <w:p>
+            <w:pPr>
+              <w:bidi w:val="false"/>
+              <w:jc w:val="left"/>
+            </w:pPr>
+            <w:r>
+              <w:rPr>
+                <w:b w:val="false"/>
+                <w:bCs w:val="false"/>
+                <w:i w:val="false"/>
+                <w:iCs w:val="false"/>
+                <w:color w:val="17242D"/>
+                <w:rtl w:val="false"/>
+              </w:rPr>
+              <w:t xml:space="preserve"/>
+            </w:r>
+          </w:p>
+        </w:tc>
+        <w:tc>
+          <w:tcPr>
+            <w:tcW w:type="dxa" w:w="1805"/>
+            <w:shd w:fill="FFFFFF"/>
+          </w:tcPr>
+          <w:p>
+            <w:pPr>
+              <w:bidi w:val="false"/>
+              <w:jc w:val="left"/>
+            </w:pPr>
+            <w:r>
+              <w:rPr>
+                <w:b w:val="false"/>
+                <w:bCs w:val="false"/>
+                <w:i w:val="false"/>
+                <w:iCs w:val="false"/>
+                <w:color w:val="17242D"/>
+                <w:rtl w:val="false"/>
+              </w:rPr>
+              <w:t xml:space="preserve"/>
+            </w:r>
+          </w:p>
+        </w:tc>
+      </w:tr>
+      <w:tr>
+        <w:trPr>
+          <w:trHeight w:val="454" w:hRule="atLeast"/>
+        </w:trPr>
+        <w:tc>
+          <w:tcPr>
+            <w:tcW w:type="dxa" w:w="1806"/>
+            <w:shd w:fill="FFFFFF"/>
+          </w:tcPr>
+          <w:p>
+            <w:pPr>
+              <w:bidi w:val="false"/>
+              <w:jc w:val="left"/>
+            </w:pPr>
+            <w:r>
+              <w:rPr>
+                <w:b w:val="false"/>
+                <w:bCs w:val="false"/>
+                <w:i w:val="false"/>
+                <w:iCs w:val="false"/>
+                <w:color w:val="17242D"/>
+                <w:rtl w:val="false"/>
+              </w:rPr>
+              <w:t xml:space="preserve"/>
+            </w:r>
+          </w:p>
+        </w:tc>
+        <w:tc>
+          <w:tcPr>
+            <w:tcW w:type="dxa" w:w="1805"/>
+            <w:shd w:fill="FFFFFF"/>
+          </w:tcPr>
+          <w:p>
+            <w:pPr>
+              <w:bidi w:val="false"/>
+              <w:jc w:val="left"/>
+            </w:pPr>
+            <w:r>
+              <w:rPr>
+                <w:b w:val="false"/>
+                <w:bCs w:val="false"/>
+                <w:i w:val="false"/>
+                <w:iCs w:val="false"/>
+                <w:color w:val="17242D"/>
+                <w:rtl w:val="false"/>
+              </w:rPr>
+              <w:t xml:space="preserve"/>
+            </w:r>
+          </w:p>
+        </w:tc>
+        <w:tc>
+          <w:tcPr>
+            <w:tcW w:type="dxa" w:w="1805"/>
+            <w:shd w:fill="FFFFFF"/>
+          </w:tcPr>
+          <w:p>
+            <w:pPr>
+              <w:bidi w:val="false"/>
+              <w:jc w:val="left"/>
+            </w:pPr>
+            <w:r>
+              <w:rPr>
+                <w:b w:val="false"/>
+                <w:bCs w:val="false"/>
+                <w:i w:val="false"/>
+                <w:iCs w:val="false"/>
+                <w:color w:val="17242D"/>
+                <w:rtl w:val="false"/>
+              </w:rPr>
+              <w:t xml:space="preserve"/>
+            </w:r>
+          </w:p>
+        </w:tc>
+        <w:tc>
+          <w:tcPr>
+            <w:tcW w:type="dxa" w:w="1805"/>
+            <w:shd w:fill="FFFFFF"/>
+          </w:tcPr>
+          <w:p>
+            <w:pPr>
+              <w:bidi w:val="false"/>
+              <w:jc w:val="left"/>
+            </w:pPr>
+            <w:r>
+              <w:rPr>
+                <w:b w:val="false"/>
+                <w:bCs w:val="false"/>
+                <w:i w:val="false"/>
+                <w:iCs w:val="false"/>
+                <w:color w:val="17242D"/>
+                <w:rtl w:val="false"/>
+              </w:rPr>
+              <w:t xml:space="preserve"/>
+            </w:r>
+          </w:p>
+        </w:tc>
+        <w:tc>
+          <w:tcPr>
+            <w:tcW w:type="dxa" w:w="1805"/>
+            <w:shd w:fill="FFFFFF"/>
+          </w:tcPr>
+          <w:p>
+            <w:pPr>
+              <w:bidi w:val="false"/>
+              <w:jc w:val="left"/>
+            </w:pPr>
+            <w:r>
+              <w:rPr>
+                <w:b w:val="false"/>
+                <w:bCs w:val="false"/>
+                <w:i w:val="false"/>
+                <w:iCs w:val="false"/>
+                <w:color w:val="17242D"/>
+                <w:rtl w:val="false"/>
+              </w:rPr>
+              <w:t xml:space="preserve"/>
+            </w:r>
+          </w:p>
+        </w:tc>
+      </w:tr>
+      <w:tr>
+        <w:trPr>
+          <w:trHeight w:val="454" w:hRule="atLeast"/>
+        </w:trPr>
+        <w:tc>
+          <w:tcPr>
+            <w:tcW w:type="dxa" w:w="1806"/>
+            <w:shd w:fill="FFFFFF"/>
+          </w:tcPr>
+          <w:p>
+            <w:pPr>
+              <w:bidi w:val="false"/>
+              <w:jc w:val="left"/>
+            </w:pPr>
+            <w:r>
+              <w:rPr>
+                <w:b w:val="false"/>
+                <w:bCs w:val="false"/>
+                <w:i w:val="false"/>
+                <w:iCs w:val="false"/>
+                <w:color w:val="17242D"/>
+                <w:rtl w:val="false"/>
+              </w:rPr>
+              <w:t xml:space="preserve"/>
+            </w:r>
+          </w:p>
+        </w:tc>
+        <w:tc>
+          <w:tcPr>
+            <w:tcW w:type="dxa" w:w="1805"/>
+            <w:shd w:fill="FFFFFF"/>
+          </w:tcPr>
+          <w:p>
+            <w:pPr>
+              <w:bidi w:val="false"/>
+              <w:jc w:val="left"/>
+            </w:pPr>
+            <w:r>
+              <w:rPr>
+                <w:b w:val="false"/>
+                <w:bCs w:val="false"/>
+                <w:i w:val="false"/>
+                <w:iCs w:val="false"/>
+                <w:color w:val="17242D"/>
+                <w:rtl w:val="false"/>
+              </w:rPr>
+              <w:t xml:space="preserve"/>
+            </w:r>
+          </w:p>
+        </w:tc>
+        <w:tc>
+          <w:tcPr>
+            <w:tcW w:type="dxa" w:w="1805"/>
+            <w:shd w:fill="FFFFFF"/>
+          </w:tcPr>
+          <w:p>
+            <w:pPr>
+              <w:bidi w:val="false"/>
+              <w:jc w:val="left"/>
+            </w:pPr>
+            <w:r>
+              <w:rPr>
+                <w:b w:val="false"/>
+                <w:bCs w:val="false"/>
+                <w:i w:val="false"/>
+                <w:iCs w:val="false"/>
+                <w:color w:val="17242D"/>
+                <w:rtl w:val="false"/>
+              </w:rPr>
+              <w:t xml:space="preserve"/>
+            </w:r>
+          </w:p>
+        </w:tc>
+        <w:tc>
+          <w:tcPr>
+            <w:tcW w:type="dxa" w:w="1805"/>
+            <w:shd w:fill="FFFFFF"/>
+          </w:tcPr>
+          <w:p>
+            <w:pPr>
+              <w:bidi w:val="false"/>
+              <w:jc w:val="left"/>
+            </w:pPr>
+            <w:r>
+              <w:rPr>
+                <w:b w:val="false"/>
+                <w:bCs w:val="false"/>
+                <w:i w:val="false"/>
+                <w:iCs w:val="false"/>
+                <w:color w:val="17242D"/>
+                <w:rtl w:val="false"/>
+              </w:rPr>
+              <w:t xml:space="preserve"/>
+            </w:r>
+          </w:p>
+        </w:tc>
+        <w:tc>
+          <w:tcPr>
+            <w:tcW w:type="dxa" w:w="1805"/>
+            <w:shd w:fill="FFFFFF"/>
+          </w:tcPr>
+          <w:p>
+            <w:pPr>
+              <w:bidi w:val="false"/>
+              <w:jc w:val="left"/>
+            </w:pPr>
+            <w:r>
+              <w:rPr>
+                <w:b w:val="false"/>
+                <w:bCs w:val="false"/>
+                <w:i w:val="false"/>
+                <w:iCs w:val="false"/>
+                <w:color w:val="17242D"/>
+                <w:rtl w:val="false"/>
+              </w:rPr>
+              <w:t xml:space="preserve"/>
             </w:r>
           </w:p>
         </w:tc>
@@ -21743,7 +22238,7 @@
           <w:color w:val="17242D"/>
           <w:rtl w:val="false"/>
         </w:rPr>
-        <w:t xml:space="preserve">Carry one idea through the whole pipeline — a generated image, a fix, an animated clip of your own image, a second clip generated from text alone, a narration, and a deck assembled two ways — labelling every generated piece as you go.</w:t>
+        <w:t xml:space="preserve">Carry one idea through the whole pipeline — a generated image, a fix, an animated clip of the image you generated, a second clip generated from text alone, a narration, and a deck assembled two ways — labelling every generated piece as you go.</w:t>
       </w:r>
     </w:p>
     <w:p>
@@ -21995,7 +22490,7 @@
                 <w:color w:val="17242D"/>
                 <w:rtl w:val="false"/>
               </w:rPr>
-              <w:t xml:space="preserve">Add a tool comparison at the generate and fix stages (stages 1–2), and a working narration synced to the deck.</w:t>
+              <w:t xml:space="preserve">Add a tool comparison at the generate and fix stages (stages 1–2), and sync the narration precisely to the deck.</w:t>
             </w:r>
           </w:p>
         </w:tc>

</xml_diff>